<commit_message>
feat: core admin lifecycle, compliance & watchlist system enhancements
- Implement configurable payment deadlines (48h, 72h, 7d, 30d, 90d, custom) and escalation rules (LOWEST_UNIQUE_BID, MANUAL_REVIEW, AUTO_FORFEIT_CLOSE) per auction with dynamic closure recalculation.
- Add comprehensive audit trail logging and inspection modal for auction lifecycle events.
- Implement winner and bidder management dashboards with bidder history ledger and compliance score tracking.
- Add dispute resolution evidence attachment viewer and determination modal.
- Add UNCITRAL/ICC compliant escrow summary and multi-gateway reconciliation in settlement reporting.
- Fix watchlist 400 validation error on upcoming drops by persisting preview items client-side and validating auction IDs cleanly.
- Upgrade mobile and web Watchlist screens with tabs (All, Live, Drops, Closed), search, and guest sign-in banner.
- Fix mobile AuctionCard touch event bubbling bug and remove redundant bottom menu signout button.
</commit_message>
<xml_diff>
--- a/docs/output/docx/README.docx
+++ b/docs/output/docx/README.docx
@@ -23,7 +23,7 @@
         <w:pStyle w:val="Date"/>
       </w:pPr>
       <w:r>
-        <w:t xml:space="preserve">August 21, 2026</w:t>
+        <w:t xml:space="preserve">September 19, 2026</w:t>
       </w:r>
     </w:p>
     <w:sdt>
@@ -52,7 +52,7 @@
         </w:p>
       </w:sdtContent>
     </w:sdt>
-    <w:bookmarkStart w:id="16" w:name="takelow"/>
+    <w:bookmarkStart w:id="31" w:name="takelow"/>
     <w:p>
       <w:pPr>
         <w:pStyle w:val="Heading1"/>
@@ -108,7 +108,14 @@
         <w:t xml:space="preserve">“Take It. Low.”</w:t>
       </w:r>
     </w:p>
-    <w:bookmarkStart w:id="9" w:name="architecture"/>
+    <w:p>
+      <w:r>
+        <w:pict>
+          <v:rect style="width:0;height:1.5pt" o:hralign="center" o:hrstd="t" o:hr="t"/>
+        </w:pict>
+      </w:r>
+    </w:p>
+    <w:bookmarkStart w:id="11" w:name="architecture"/>
     <w:p>
       <w:pPr>
         <w:pStyle w:val="Heading2"/>
@@ -217,7 +224,7 @@
               <w:pStyle w:val="Compact"/>
             </w:pPr>
             <w:r>
-              <w:t xml:space="preserve">JWT auth, user registration, wallet, PIN, OTP, notifications</w:t>
+              <w:t xml:space="preserve">Better-auth authentication, user registration, wallet, PIN, OTP, notifications, RBAC, disputes, T&amp;C</w:t>
             </w:r>
           </w:p>
         </w:tc>
@@ -255,7 +262,7 @@
               <w:pStyle w:val="Compact"/>
             </w:pPr>
             <w:r>
-              <w:t xml:space="preserve">Real-time bidding, WebSockets, Redis bid tracking, BullMQ workers, winner determination, payments</w:t>
+              <w:t xml:space="preserve">Real-time bidding, WebSockets (Redis adapter), Redis bid tracking, BullMQ workers, winner determination, payments, product approval, payment reminders</w:t>
             </w:r>
           </w:p>
         </w:tc>
@@ -293,22 +300,45 @@
               <w:pStyle w:val="Compact"/>
             </w:pPr>
             <w:r>
-              <w:t xml:space="preserve">Read-optimized auction/product queries, favorites, admin stats (uses Postgres read replica when</w:t>
-            </w:r>
-            <w:r>
-              <w:t xml:space="preserve"> </w:t>
-            </w:r>
+              <w:t xml:space="preserve">Read-optimized auction/product queries, Redis caching, favorites, admin stats, settlement reports, analytics, audit viewer, winner management</w:t>
+            </w:r>
+          </w:p>
+        </w:tc>
+      </w:tr>
+      <w:tr>
+        <w:tc>
+          <w:tcPr/>
+          <w:p>
+            <w:pPr>
+              <w:pStyle w:val="Compact"/>
+            </w:pPr>
             <w:r>
               <w:rPr>
                 <w:rStyle w:val="VerbatimChar"/>
               </w:rPr>
-              <w:t xml:space="preserve">READ_REPLICA_URL</w:t>
-            </w:r>
-            <w:r>
-              <w:t xml:space="preserve"> </w:t>
-            </w:r>
-            <w:r>
-              <w:t xml:space="preserve">is set)</w:t>
+              <w:t xml:space="preserve">takelow-web</w:t>
+            </w:r>
+          </w:p>
+        </w:tc>
+        <w:tc>
+          <w:tcPr/>
+          <w:p>
+            <w:pPr>
+              <w:pStyle w:val="Compact"/>
+            </w:pPr>
+            <w:r>
+              <w:t xml:space="preserve">5173 (dev) / 80 (docker)</w:t>
+            </w:r>
+          </w:p>
+        </w:tc>
+        <w:tc>
+          <w:tcPr/>
+          <w:p>
+            <w:pPr>
+              <w:pStyle w:val="Compact"/>
+            </w:pPr>
+            <w:r>
+              <w:t xml:space="preserve">React + Tailwind SPA</w:t>
             </w:r>
           </w:p>
         </w:tc>
@@ -324,44 +354,6 @@
               <w:rPr>
                 <w:rStyle w:val="VerbatimChar"/>
               </w:rPr>
-              <w:t xml:space="preserve">takelow-web</w:t>
-            </w:r>
-          </w:p>
-        </w:tc>
-        <w:tc>
-          <w:tcPr/>
-          <w:p>
-            <w:pPr>
-              <w:pStyle w:val="Compact"/>
-            </w:pPr>
-            <w:r>
-              <w:t xml:space="preserve">5173 (dev) / 80 (docker)</w:t>
-            </w:r>
-          </w:p>
-        </w:tc>
-        <w:tc>
-          <w:tcPr/>
-          <w:p>
-            <w:pPr>
-              <w:pStyle w:val="Compact"/>
-            </w:pPr>
-            <w:r>
-              <w:t xml:space="preserve">React + Tailwind SPA</w:t>
-            </w:r>
-          </w:p>
-        </w:tc>
-      </w:tr>
-      <w:tr>
-        <w:tc>
-          <w:tcPr/>
-          <w:p>
-            <w:pPr>
-              <w:pStyle w:val="Compact"/>
-            </w:pPr>
-            <w:r>
-              <w:rPr>
-                <w:rStyle w:val="VerbatimChar"/>
-              </w:rPr>
               <w:t xml:space="preserve">takelow-app</w:t>
             </w:r>
           </w:p>
@@ -390,26 +382,591 @@
         </w:tc>
       </w:tr>
     </w:tbl>
-    <w:p>
-      <w:pPr>
-        <w:pStyle w:val="BodyText"/>
+    <w:bookmarkStart w:id="9" w:name="technology-stack"/>
+    <w:p>
+      <w:pPr>
+        <w:pStyle w:val="Heading3"/>
+      </w:pPr>
+      <w:r>
+        <w:rPr>
+          <w:rStyle w:val="SectionNumber"/>
+        </w:rPr>
+        <w:t xml:space="preserve">1.1.1</w:t>
+      </w:r>
+      <w:r>
+        <w:tab/>
+      </w:r>
+      <w:r>
+        <w:t xml:space="preserve">Technology Stack</w:t>
+      </w:r>
+    </w:p>
+    <w:tbl>
+      <w:tblPr>
+        <w:tblStyle w:val="Table"/>
+        <w:tblW w:type="pct" w:w="5000"/>
+        <w:tblLayout w:type="fixed"/>
+        <w:tblLook w:firstRow="1" w:lastRow="0" w:firstColumn="0" w:lastColumn="0" w:noHBand="0" w:noVBand="0" w:val="0020"/>
+      </w:tblPr>
+      <w:tblGrid>
+        <w:gridCol w:w="3080"/>
+        <w:gridCol w:w="4840"/>
+      </w:tblGrid>
+      <w:tr>
+        <w:trPr>
+          <w:tblHeader w:val="on"/>
+        </w:trPr>
+        <w:tc>
+          <w:tcPr/>
+          <w:p>
+            <w:pPr>
+              <w:pStyle w:val="Compact"/>
+            </w:pPr>
+            <w:r>
+              <w:t xml:space="preserve">Layer</w:t>
+            </w:r>
+          </w:p>
+        </w:tc>
+        <w:tc>
+          <w:tcPr/>
+          <w:p>
+            <w:pPr>
+              <w:pStyle w:val="Compact"/>
+            </w:pPr>
+            <w:r>
+              <w:t xml:space="preserve">Technology</w:t>
+            </w:r>
+          </w:p>
+        </w:tc>
+      </w:tr>
+      <w:tr>
+        <w:tc>
+          <w:tcPr/>
+          <w:p>
+            <w:pPr>
+              <w:pStyle w:val="Compact"/>
+            </w:pPr>
+            <w:r>
+              <w:rPr>
+                <w:b/>
+                <w:bCs/>
+              </w:rPr>
+              <w:t xml:space="preserve">ORM</w:t>
+            </w:r>
+          </w:p>
+        </w:tc>
+        <w:tc>
+          <w:tcPr/>
+          <w:p>
+            <w:pPr>
+              <w:pStyle w:val="Compact"/>
+            </w:pPr>
+            <w:r>
+              <w:t xml:space="preserve">Prisma 7 (all 3 services)</w:t>
+            </w:r>
+          </w:p>
+        </w:tc>
+      </w:tr>
+      <w:tr>
+        <w:tc>
+          <w:tcPr/>
+          <w:p>
+            <w:pPr>
+              <w:pStyle w:val="Compact"/>
+            </w:pPr>
+            <w:r>
+              <w:rPr>
+                <w:b/>
+                <w:bCs/>
+              </w:rPr>
+              <w:t xml:space="preserve">Auth</w:t>
+            </w:r>
+          </w:p>
+        </w:tc>
+        <w:tc>
+          <w:tcPr/>
+          <w:p>
+            <w:pPr>
+              <w:pStyle w:val="Compact"/>
+            </w:pPr>
+            <w:r>
+              <w:t xml:space="preserve">Better-auth (identity-service) + JwtAuthGuard (auction-engine, query-service)</w:t>
+            </w:r>
+          </w:p>
+        </w:tc>
+      </w:tr>
+      <w:tr>
+        <w:tc>
+          <w:tcPr/>
+          <w:p>
+            <w:pPr>
+              <w:pStyle w:val="Compact"/>
+            </w:pPr>
+            <w:r>
+              <w:rPr>
+                <w:b/>
+                <w:bCs/>
+              </w:rPr>
+              <w:t xml:space="preserve">RBAC</w:t>
+            </w:r>
+          </w:p>
+        </w:tc>
+        <w:tc>
+          <w:tcPr/>
+          <w:p>
+            <w:pPr>
+              <w:pStyle w:val="Compact"/>
+            </w:pPr>
+            <w:r>
+              <w:t xml:space="preserve">CASL ability-based access control with enterprise role hierarchy</w:t>
+            </w:r>
+          </w:p>
+        </w:tc>
+      </w:tr>
+      <w:tr>
+        <w:tc>
+          <w:tcPr/>
+          <w:p>
+            <w:pPr>
+              <w:pStyle w:val="Compact"/>
+            </w:pPr>
+            <w:r>
+              <w:rPr>
+                <w:b/>
+                <w:bCs/>
+              </w:rPr>
+              <w:t xml:space="preserve">Database</w:t>
+            </w:r>
+          </w:p>
+        </w:tc>
+        <w:tc>
+          <w:tcPr/>
+          <w:p>
+            <w:pPr>
+              <w:pStyle w:val="Compact"/>
+            </w:pPr>
+            <w:r>
+              <w:t xml:space="preserve">PostgreSQL 15 + Citus 12.1 (distributed)</w:t>
+            </w:r>
+          </w:p>
+        </w:tc>
+      </w:tr>
+      <w:tr>
+        <w:tc>
+          <w:tcPr/>
+          <w:p>
+            <w:pPr>
+              <w:pStyle w:val="Compact"/>
+            </w:pPr>
+            <w:r>
+              <w:rPr>
+                <w:b/>
+                <w:bCs/>
+              </w:rPr>
+              <w:t xml:space="preserve">Cache</w:t>
+            </w:r>
+          </w:p>
+        </w:tc>
+        <w:tc>
+          <w:tcPr/>
+          <w:p>
+            <w:pPr>
+              <w:pStyle w:val="Compact"/>
+            </w:pPr>
+            <w:r>
+              <w:t xml:space="preserve">Redis 7 (caching, rate limiting, queues, WebSocket adapter, pub/sub)</w:t>
+            </w:r>
+          </w:p>
+        </w:tc>
+      </w:tr>
+      <w:tr>
+        <w:tc>
+          <w:tcPr/>
+          <w:p>
+            <w:pPr>
+              <w:pStyle w:val="Compact"/>
+            </w:pPr>
+            <w:r>
+              <w:rPr>
+                <w:b/>
+                <w:bCs/>
+              </w:rPr>
+              <w:t xml:space="preserve">Queue</w:t>
+            </w:r>
+          </w:p>
+        </w:tc>
+        <w:tc>
+          <w:tcPr/>
+          <w:p>
+            <w:pPr>
+              <w:pStyle w:val="Compact"/>
+            </w:pPr>
+            <w:r>
+              <w:t xml:space="preserve">BullMQ (batched bid persistence, notification dispatch)</w:t>
+            </w:r>
+          </w:p>
+        </w:tc>
+      </w:tr>
+      <w:tr>
+        <w:tc>
+          <w:tcPr/>
+          <w:p>
+            <w:pPr>
+              <w:pStyle w:val="Compact"/>
+            </w:pPr>
+            <w:r>
+              <w:rPr>
+                <w:b/>
+                <w:bCs/>
+              </w:rPr>
+              <w:t xml:space="preserve">Real-time</w:t>
+            </w:r>
+          </w:p>
+        </w:tc>
+        <w:tc>
+          <w:tcPr/>
+          <w:p>
+            <w:pPr>
+              <w:pStyle w:val="Compact"/>
+            </w:pPr>
+            <w:r>
+              <w:t xml:space="preserve">Socket.io 4 with Redis adapter for horizontal scaling</w:t>
+            </w:r>
+          </w:p>
+        </w:tc>
+      </w:tr>
+      <w:tr>
+        <w:tc>
+          <w:tcPr/>
+          <w:p>
+            <w:pPr>
+              <w:pStyle w:val="Compact"/>
+            </w:pPr>
+            <w:r>
+              <w:rPr>
+                <w:b/>
+                <w:bCs/>
+              </w:rPr>
+              <w:t xml:space="preserve">Framework</w:t>
+            </w:r>
+          </w:p>
+        </w:tc>
+        <w:tc>
+          <w:tcPr/>
+          <w:p>
+            <w:pPr>
+              <w:pStyle w:val="Compact"/>
+            </w:pPr>
+            <w:r>
+              <w:t xml:space="preserve">NestJS 10 + TypeScript 5 (strict mode)</w:t>
+            </w:r>
+          </w:p>
+        </w:tc>
+      </w:tr>
+      <w:tr>
+        <w:tc>
+          <w:tcPr/>
+          <w:p>
+            <w:pPr>
+              <w:pStyle w:val="Compact"/>
+            </w:pPr>
+            <w:r>
+              <w:rPr>
+                <w:b/>
+                <w:bCs/>
+              </w:rPr>
+              <w:t xml:space="preserve">Frontend</w:t>
+            </w:r>
+          </w:p>
+        </w:tc>
+        <w:tc>
+          <w:tcPr/>
+          <w:p>
+            <w:pPr>
+              <w:pStyle w:val="Compact"/>
+            </w:pPr>
+            <w:r>
+              <w:t xml:space="preserve">React 19 + Vite 5 + Tailwind CSS 3</w:t>
+            </w:r>
+          </w:p>
+        </w:tc>
+      </w:tr>
+      <w:tr>
+        <w:tc>
+          <w:tcPr/>
+          <w:p>
+            <w:pPr>
+              <w:pStyle w:val="Compact"/>
+            </w:pPr>
+            <w:r>
+              <w:rPr>
+                <w:b/>
+                <w:bCs/>
+              </w:rPr>
+              <w:t xml:space="preserve">Mobile</w:t>
+            </w:r>
+          </w:p>
+        </w:tc>
+        <w:tc>
+          <w:tcPr/>
+          <w:p>
+            <w:pPr>
+              <w:pStyle w:val="Compact"/>
+            </w:pPr>
+            <w:r>
+              <w:t xml:space="preserve">React Native 0.86 + Expo SDK 52</w:t>
+            </w:r>
+          </w:p>
+        </w:tc>
+      </w:tr>
+      <w:tr>
+        <w:tc>
+          <w:tcPr/>
+          <w:p>
+            <w:pPr>
+              <w:pStyle w:val="Compact"/>
+            </w:pPr>
+            <w:r>
+              <w:rPr>
+                <w:b/>
+                <w:bCs/>
+              </w:rPr>
+              <w:t xml:space="preserve">Deployment</w:t>
+            </w:r>
+          </w:p>
+        </w:tc>
+        <w:tc>
+          <w:tcPr/>
+          <w:p>
+            <w:pPr>
+              <w:pStyle w:val="Compact"/>
+            </w:pPr>
+            <w:r>
+              <w:t xml:space="preserve">Docker Compose (dev), Kubernetes (production)</w:t>
+            </w:r>
+          </w:p>
+        </w:tc>
+      </w:tr>
+    </w:tbl>
+    <w:bookmarkEnd w:id="9"/>
+    <w:bookmarkStart w:id="10" w:name="data-layer"/>
+    <w:p>
+      <w:pPr>
+        <w:pStyle w:val="Heading3"/>
+      </w:pPr>
+      <w:r>
+        <w:rPr>
+          <w:rStyle w:val="SectionNumber"/>
+        </w:rPr>
+        <w:t xml:space="preserve">1.1.2</w:t>
+      </w:r>
+      <w:r>
+        <w:tab/>
+      </w:r>
+      <w:r>
+        <w:t xml:space="preserve">Data Layer</w:t>
+      </w:r>
+    </w:p>
+    <w:p>
+      <w:pPr>
+        <w:pStyle w:val="FirstParagraph"/>
+      </w:pPr>
+      <w:r>
+        <w:t xml:space="preserve">PostgreSQL 15 (Citus) + Redis 7 (bid tracking, rate limiting, queues, caching, WebSocket adapter) + BullMQ (batched bid persistence).</w:t>
+      </w:r>
+    </w:p>
+    <w:p>
+      <w:r>
+        <w:pict>
+          <v:rect style="width:0;height:1.5pt" o:hralign="center" o:hrstd="t" o:hr="t"/>
+        </w:pict>
+      </w:r>
+    </w:p>
+    <w:bookmarkEnd w:id="10"/>
+    <w:bookmarkEnd w:id="11"/>
+    <w:bookmarkStart w:id="12" w:name="enterprise-rbac-casl"/>
+    <w:p>
+      <w:pPr>
+        <w:pStyle w:val="Heading2"/>
+      </w:pPr>
+      <w:r>
+        <w:rPr>
+          <w:rStyle w:val="SectionNumber"/>
+        </w:rPr>
+        <w:t xml:space="preserve">1.2</w:t>
+      </w:r>
+      <w:r>
+        <w:tab/>
+      </w:r>
+      <w:r>
+        <w:t xml:space="preserve">Enterprise RBAC (CASL)</w:t>
+      </w:r>
+    </w:p>
+    <w:p>
+      <w:pPr>
+        <w:pStyle w:val="FirstParagraph"/>
+      </w:pPr>
+      <w:r>
+        <w:t xml:space="preserve">TakeLow implements enterprise-grade role-based access control using CASL:</w:t>
+      </w:r>
+    </w:p>
+    <w:p>
+      <w:pPr>
+        <w:pStyle w:val="SourceCode"/>
+      </w:pPr>
+      <w:r>
+        <w:rPr>
+          <w:rStyle w:val="VerbatimChar"/>
+        </w:rPr>
+        <w:t xml:space="preserve">Level 1: CEO / Admin     → Full system access (all divisions, departments, sections)</w:t>
+      </w:r>
+      <w:r>
+        <w:br/>
+      </w:r>
+      <w:r>
+        <w:rPr>
+          <w:rStyle w:val="VerbatimChar"/>
+        </w:rPr>
+        <w:t xml:space="preserve">Level 2: CXO             → Division-level access (CFO, CCO, CTO)</w:t>
+      </w:r>
+      <w:r>
+        <w:br/>
+      </w:r>
+      <w:r>
+        <w:rPr>
+          <w:rStyle w:val="VerbatimChar"/>
+        </w:rPr>
+        <w:t xml:space="preserve">Level 3: Director        → Department-level access</w:t>
+      </w:r>
+      <w:r>
+        <w:br/>
+      </w:r>
+      <w:r>
+        <w:rPr>
+          <w:rStyle w:val="VerbatimChar"/>
+        </w:rPr>
+        <w:t xml:space="preserve">Level 4: Manager         → Section-level access</w:t>
+      </w:r>
+      <w:r>
+        <w:br/>
+      </w:r>
+      <w:r>
+        <w:rPr>
+          <w:rStyle w:val="VerbatimChar"/>
+        </w:rPr>
+        <w:t xml:space="preserve">Level 5: Expert          → Functional area access</w:t>
+      </w:r>
+      <w:r>
+        <w:br/>
+      </w:r>
+      <w:r>
+        <w:rPr>
+          <w:rStyle w:val="VerbatimChar"/>
+        </w:rPr>
+        <w:t xml:space="preserve">Level 6: Specialist      → Narrow module scope</w:t>
+      </w:r>
+      <w:r>
+        <w:br/>
+      </w:r>
+      <w:r>
+        <w:rPr>
+          <w:rStyle w:val="VerbatimChar"/>
+        </w:rPr>
+        <w:t xml:space="preserve">Level 7: Analyst         → Read-only/reporting access</w:t>
+      </w:r>
+      <w:r>
+        <w:br/>
+      </w:r>
+      <w:r>
+        <w:rPr>
+          <w:rStyle w:val="VerbatimChar"/>
+        </w:rPr>
+        <w:t xml:space="preserve">Level 7: User            → Standard user (bidding, wallet, favorites)</w:t>
+      </w:r>
+    </w:p>
+    <w:p>
+      <w:pPr>
+        <w:pStyle w:val="FirstParagraph"/>
       </w:pPr>
       <w:r>
         <w:rPr>
           <w:b/>
           <w:bCs/>
         </w:rPr>
-        <w:t xml:space="preserve">Data layer:</w:t>
-      </w:r>
-      <w:r>
-        <w:t xml:space="preserve"> </w:t>
-      </w:r>
-      <w:r>
-        <w:t xml:space="preserve">PostgreSQL 15 (Citus) + Redis 7 (bid tracking, rate limiting, queues) + BullMQ (batched bid persistence).</w:t>
-      </w:r>
-    </w:p>
-    <w:bookmarkEnd w:id="9"/>
-    <w:bookmarkStart w:id="10" w:name="quick-start"/>
+        <w:t xml:space="preserve">Features:</w:t>
+      </w:r>
+      <w:r>
+        <w:t xml:space="preserve"> </w:t>
+      </w:r>
+      <w:r>
+        <w:t xml:space="preserve">- CASL ability factory with granular action+subject permissions</w:t>
+      </w:r>
+      <w:r>
+        <w:t xml:space="preserve"> </w:t>
+      </w:r>
+      <w:r>
+        <w:t xml:space="preserve">-</w:t>
+      </w:r>
+      <w:r>
+        <w:t xml:space="preserve"> </w:t>
+      </w:r>
+      <w:r>
+        <w:rPr>
+          <w:rStyle w:val="VerbatimChar"/>
+        </w:rPr>
+        <w:t xml:space="preserve">@RequireAbility(action, subject)</w:t>
+      </w:r>
+      <w:r>
+        <w:t xml:space="preserve"> </w:t>
+      </w:r>
+      <w:r>
+        <w:t xml:space="preserve">decorator for endpoint protection</w:t>
+      </w:r>
+      <w:r>
+        <w:t xml:space="preserve"> </w:t>
+      </w:r>
+      <w:r>
+        <w:t xml:space="preserve">- Dynamic permission overrides (temporary elevated access with expiry)</w:t>
+      </w:r>
+      <w:r>
+        <w:t xml:space="preserve"> </w:t>
+      </w:r>
+      <w:r>
+        <w:t xml:space="preserve">- Access decision audit logging (every access attempt logged)</w:t>
+      </w:r>
+      <w:r>
+        <w:t xml:space="preserve"> </w:t>
+      </w:r>
+      <w:r>
+        <w:t xml:space="preserve">- Organizational structure (divisions → departments → sections)</w:t>
+      </w:r>
+      <w:r>
+        <w:t xml:space="preserve"> </w:t>
+      </w:r>
+      <w:r>
+        <w:t xml:space="preserve">- UI enforcement API (</w:t>
+      </w:r>
+      <w:r>
+        <w:rPr>
+          <w:rStyle w:val="VerbatimChar"/>
+        </w:rPr>
+        <w:t xml:space="preserve">GET /rbac/abilities</w:t>
+      </w:r>
+      <w:r>
+        <w:t xml:space="preserve"> </w:t>
+      </w:r>
+      <w:r>
+        <w:t xml:space="preserve">returns permissions for frontend)</w:t>
+      </w:r>
+    </w:p>
+    <w:p>
+      <w:r>
+        <w:pict>
+          <v:rect style="width:0;height:1.5pt" o:hralign="center" o:hrstd="t" o:hr="t"/>
+        </w:pict>
+      </w:r>
+    </w:p>
+    <w:bookmarkEnd w:id="12"/>
+    <w:bookmarkStart w:id="13" w:name="quick-start"/>
     <w:p>
       <w:pPr>
         <w:pStyle w:val="Heading2"/>
@@ -418,13 +975,13 @@
         <w:rPr>
           <w:rStyle w:val="SectionNumber"/>
         </w:rPr>
-        <w:t xml:space="preserve">1.2</w:t>
+        <w:t xml:space="preserve">1.3</w:t>
       </w:r>
       <w:r>
         <w:tab/>
       </w:r>
       <w:r>
-        <w:t xml:space="preserve">Quick start</w:t>
+        <w:t xml:space="preserve">Quick Start</w:t>
       </w:r>
     </w:p>
     <w:p>
@@ -534,8 +1091,8 @@
         <w:t xml:space="preserve"> run services</w:t>
       </w:r>
     </w:p>
-    <w:bookmarkEnd w:id="10"/>
-    <w:bookmarkStart w:id="11" w:name="common-commands"/>
+    <w:bookmarkEnd w:id="13"/>
+    <w:bookmarkStart w:id="14" w:name="common-commands"/>
     <w:p>
       <w:pPr>
         <w:pStyle w:val="Heading2"/>
@@ -544,13 +1101,13 @@
         <w:rPr>
           <w:rStyle w:val="SectionNumber"/>
         </w:rPr>
-        <w:t xml:space="preserve">1.3</w:t>
+        <w:t xml:space="preserve">1.4</w:t>
       </w:r>
       <w:r>
         <w:tab/>
       </w:r>
       <w:r>
-        <w:t xml:space="preserve">Common commands</w:t>
+        <w:t xml:space="preserve">Common Commands</w:t>
       </w:r>
     </w:p>
     <w:tbl>
@@ -760,14 +1317,14 @@
               <w:pStyle w:val="Compact"/>
             </w:pPr>
             <w:r>
-              <w:t xml:space="preserve">Seed 30 users + 2 admins + 10 auctions</w:t>
+              <w:t xml:space="preserve">Seed 30 users + enterprise roles + 24 products + 24 auctions</w:t>
             </w:r>
           </w:p>
         </w:tc>
       </w:tr>
     </w:tbl>
-    <w:bookmarkEnd w:id="11"/>
-    <w:bookmarkStart w:id="12" w:name="seed-credentials"/>
+    <w:bookmarkEnd w:id="14"/>
+    <w:bookmarkStart w:id="16" w:name="seed-credentials"/>
     <w:p>
       <w:pPr>
         <w:pStyle w:val="Heading2"/>
@@ -776,13 +1333,1741 @@
         <w:rPr>
           <w:rStyle w:val="SectionNumber"/>
         </w:rPr>
-        <w:t xml:space="preserve">1.4</w:t>
+        <w:t xml:space="preserve">1.5</w:t>
       </w:r>
       <w:r>
         <w:tab/>
       </w:r>
       <w:r>
-        <w:t xml:space="preserve">Seed credentials</w:t>
+        <w:t xml:space="preserve">Seed Credentials</w:t>
+      </w:r>
+    </w:p>
+    <w:bookmarkStart w:id="15" w:name="enterprise-roles"/>
+    <w:p>
+      <w:pPr>
+        <w:pStyle w:val="Heading3"/>
+      </w:pPr>
+      <w:r>
+        <w:rPr>
+          <w:rStyle w:val="SectionNumber"/>
+        </w:rPr>
+        <w:t xml:space="preserve">1.5.1</w:t>
+      </w:r>
+      <w:r>
+        <w:tab/>
+      </w:r>
+      <w:r>
+        <w:t xml:space="preserve">Enterprise Roles</w:t>
+      </w:r>
+    </w:p>
+    <w:tbl>
+      <w:tblPr>
+        <w:tblStyle w:val="Table"/>
+        <w:tblW w:type="auto" w:w="0"/>
+        <w:tblLook w:firstRow="1" w:lastRow="0" w:firstColumn="0" w:lastColumn="0" w:noHBand="0" w:noVBand="0" w:val="0020"/>
+      </w:tblPr>
+      <w:tblGrid>
+        <w:gridCol w:w="1980"/>
+        <w:gridCol w:w="1980"/>
+        <w:gridCol w:w="1980"/>
+        <w:gridCol w:w="1980"/>
+      </w:tblGrid>
+      <w:tr>
+        <w:trPr>
+          <w:tblHeader w:val="on"/>
+        </w:trPr>
+        <w:tc>
+          <w:tcPr/>
+          <w:p>
+            <w:pPr>
+              <w:pStyle w:val="Compact"/>
+            </w:pPr>
+            <w:r>
+              <w:t xml:space="preserve">Role</w:t>
+            </w:r>
+          </w:p>
+        </w:tc>
+        <w:tc>
+          <w:tcPr/>
+          <w:p>
+            <w:pPr>
+              <w:pStyle w:val="Compact"/>
+            </w:pPr>
+            <w:r>
+              <w:t xml:space="preserve">Phone</w:t>
+            </w:r>
+          </w:p>
+        </w:tc>
+        <w:tc>
+          <w:tcPr/>
+          <w:p>
+            <w:pPr>
+              <w:pStyle w:val="Compact"/>
+            </w:pPr>
+            <w:r>
+              <w:t xml:space="preserve">Password</w:t>
+            </w:r>
+          </w:p>
+        </w:tc>
+        <w:tc>
+          <w:tcPr/>
+          <w:p>
+            <w:pPr>
+              <w:pStyle w:val="Compact"/>
+            </w:pPr>
+            <w:r>
+              <w:t xml:space="preserve">Level</w:t>
+            </w:r>
+          </w:p>
+        </w:tc>
+      </w:tr>
+      <w:tr>
+        <w:tc>
+          <w:tcPr/>
+          <w:p>
+            <w:pPr>
+              <w:pStyle w:val="Compact"/>
+            </w:pPr>
+            <w:r>
+              <w:t xml:space="preserve">Admin/CEO</w:t>
+            </w:r>
+          </w:p>
+        </w:tc>
+        <w:tc>
+          <w:tcPr/>
+          <w:p>
+            <w:pPr>
+              <w:pStyle w:val="Compact"/>
+            </w:pPr>
+            <w:r>
+              <w:rPr>
+                <w:rStyle w:val="VerbatimChar"/>
+              </w:rPr>
+              <w:t xml:space="preserve">0911111111</w:t>
+            </w:r>
+          </w:p>
+        </w:tc>
+        <w:tc>
+          <w:tcPr/>
+          <w:p>
+            <w:pPr>
+              <w:pStyle w:val="Compact"/>
+            </w:pPr>
+            <w:r>
+              <w:rPr>
+                <w:rStyle w:val="VerbatimChar"/>
+              </w:rPr>
+              <w:t xml:space="preserve">1234</w:t>
+            </w:r>
+          </w:p>
+        </w:tc>
+        <w:tc>
+          <w:tcPr/>
+          <w:p>
+            <w:pPr>
+              <w:pStyle w:val="Compact"/>
+            </w:pPr>
+            <w:r>
+              <w:t xml:space="preserve">1</w:t>
+            </w:r>
+          </w:p>
+        </w:tc>
+      </w:tr>
+      <w:tr>
+        <w:tc>
+          <w:tcPr/>
+          <w:p>
+            <w:pPr>
+              <w:pStyle w:val="Compact"/>
+            </w:pPr>
+            <w:r>
+              <w:t xml:space="preserve">CXO (CTO)</w:t>
+            </w:r>
+          </w:p>
+        </w:tc>
+        <w:tc>
+          <w:tcPr/>
+          <w:p>
+            <w:pPr>
+              <w:pStyle w:val="Compact"/>
+            </w:pPr>
+            <w:r>
+              <w:rPr>
+                <w:rStyle w:val="VerbatimChar"/>
+              </w:rPr>
+              <w:t xml:space="preserve">0913320001</w:t>
+            </w:r>
+          </w:p>
+        </w:tc>
+        <w:tc>
+          <w:tcPr/>
+          <w:p>
+            <w:pPr>
+              <w:pStyle w:val="Compact"/>
+            </w:pPr>
+            <w:r>
+              <w:rPr>
+                <w:rStyle w:val="VerbatimChar"/>
+              </w:rPr>
+              <w:t xml:space="preserve">0000</w:t>
+            </w:r>
+          </w:p>
+        </w:tc>
+        <w:tc>
+          <w:tcPr/>
+          <w:p>
+            <w:pPr>
+              <w:pStyle w:val="Compact"/>
+            </w:pPr>
+            <w:r>
+              <w:t xml:space="preserve">2</w:t>
+            </w:r>
+          </w:p>
+        </w:tc>
+      </w:tr>
+      <w:tr>
+        <w:tc>
+          <w:tcPr/>
+          <w:p>
+            <w:pPr>
+              <w:pStyle w:val="Compact"/>
+            </w:pPr>
+            <w:r>
+              <w:t xml:space="preserve">CXO (COO)</w:t>
+            </w:r>
+          </w:p>
+        </w:tc>
+        <w:tc>
+          <w:tcPr/>
+          <w:p>
+            <w:pPr>
+              <w:pStyle w:val="Compact"/>
+            </w:pPr>
+            <w:r>
+              <w:rPr>
+                <w:rStyle w:val="VerbatimChar"/>
+              </w:rPr>
+              <w:t xml:space="preserve">0913320002</w:t>
+            </w:r>
+          </w:p>
+        </w:tc>
+        <w:tc>
+          <w:tcPr/>
+          <w:p>
+            <w:pPr>
+              <w:pStyle w:val="Compact"/>
+            </w:pPr>
+            <w:r>
+              <w:rPr>
+                <w:rStyle w:val="VerbatimChar"/>
+              </w:rPr>
+              <w:t xml:space="preserve">0000</w:t>
+            </w:r>
+          </w:p>
+        </w:tc>
+        <w:tc>
+          <w:tcPr/>
+          <w:p>
+            <w:pPr>
+              <w:pStyle w:val="Compact"/>
+            </w:pPr>
+            <w:r>
+              <w:t xml:space="preserve">2</w:t>
+            </w:r>
+          </w:p>
+        </w:tc>
+      </w:tr>
+      <w:tr>
+        <w:tc>
+          <w:tcPr/>
+          <w:p>
+            <w:pPr>
+              <w:pStyle w:val="Compact"/>
+            </w:pPr>
+            <w:r>
+              <w:t xml:space="preserve">Director</w:t>
+            </w:r>
+          </w:p>
+        </w:tc>
+        <w:tc>
+          <w:tcPr/>
+          <w:p>
+            <w:pPr>
+              <w:pStyle w:val="Compact"/>
+            </w:pPr>
+            <w:r>
+              <w:rPr>
+                <w:rStyle w:val="VerbatimChar"/>
+              </w:rPr>
+              <w:t xml:space="preserve">0913320003</w:t>
+            </w:r>
+          </w:p>
+        </w:tc>
+        <w:tc>
+          <w:tcPr/>
+          <w:p>
+            <w:pPr>
+              <w:pStyle w:val="Compact"/>
+            </w:pPr>
+            <w:r>
+              <w:rPr>
+                <w:rStyle w:val="VerbatimChar"/>
+              </w:rPr>
+              <w:t xml:space="preserve">0000</w:t>
+            </w:r>
+          </w:p>
+        </w:tc>
+        <w:tc>
+          <w:tcPr/>
+          <w:p>
+            <w:pPr>
+              <w:pStyle w:val="Compact"/>
+            </w:pPr>
+            <w:r>
+              <w:t xml:space="preserve">3</w:t>
+            </w:r>
+          </w:p>
+        </w:tc>
+      </w:tr>
+      <w:tr>
+        <w:tc>
+          <w:tcPr/>
+          <w:p>
+            <w:pPr>
+              <w:pStyle w:val="Compact"/>
+            </w:pPr>
+            <w:r>
+              <w:t xml:space="preserve">Manager</w:t>
+            </w:r>
+          </w:p>
+        </w:tc>
+        <w:tc>
+          <w:tcPr/>
+          <w:p>
+            <w:pPr>
+              <w:pStyle w:val="Compact"/>
+            </w:pPr>
+            <w:r>
+              <w:rPr>
+                <w:rStyle w:val="VerbatimChar"/>
+              </w:rPr>
+              <w:t xml:space="preserve">0913320006</w:t>
+            </w:r>
+          </w:p>
+        </w:tc>
+        <w:tc>
+          <w:tcPr/>
+          <w:p>
+            <w:pPr>
+              <w:pStyle w:val="Compact"/>
+            </w:pPr>
+            <w:r>
+              <w:rPr>
+                <w:rStyle w:val="VerbatimChar"/>
+              </w:rPr>
+              <w:t xml:space="preserve">0000</w:t>
+            </w:r>
+          </w:p>
+        </w:tc>
+        <w:tc>
+          <w:tcPr/>
+          <w:p>
+            <w:pPr>
+              <w:pStyle w:val="Compact"/>
+            </w:pPr>
+            <w:r>
+              <w:t xml:space="preserve">4</w:t>
+            </w:r>
+          </w:p>
+        </w:tc>
+      </w:tr>
+      <w:tr>
+        <w:tc>
+          <w:tcPr/>
+          <w:p>
+            <w:pPr>
+              <w:pStyle w:val="Compact"/>
+            </w:pPr>
+            <w:r>
+              <w:t xml:space="preserve">Expert</w:t>
+            </w:r>
+          </w:p>
+        </w:tc>
+        <w:tc>
+          <w:tcPr/>
+          <w:p>
+            <w:pPr>
+              <w:pStyle w:val="Compact"/>
+            </w:pPr>
+            <w:r>
+              <w:rPr>
+                <w:rStyle w:val="VerbatimChar"/>
+              </w:rPr>
+              <w:t xml:space="preserve">0913320010</w:t>
+            </w:r>
+          </w:p>
+        </w:tc>
+        <w:tc>
+          <w:tcPr/>
+          <w:p>
+            <w:pPr>
+              <w:pStyle w:val="Compact"/>
+            </w:pPr>
+            <w:r>
+              <w:rPr>
+                <w:rStyle w:val="VerbatimChar"/>
+              </w:rPr>
+              <w:t xml:space="preserve">0000</w:t>
+            </w:r>
+          </w:p>
+        </w:tc>
+        <w:tc>
+          <w:tcPr/>
+          <w:p>
+            <w:pPr>
+              <w:pStyle w:val="Compact"/>
+            </w:pPr>
+            <w:r>
+              <w:t xml:space="preserve">5</w:t>
+            </w:r>
+          </w:p>
+        </w:tc>
+      </w:tr>
+      <w:tr>
+        <w:tc>
+          <w:tcPr/>
+          <w:p>
+            <w:pPr>
+              <w:pStyle w:val="Compact"/>
+            </w:pPr>
+            <w:r>
+              <w:t xml:space="preserve">Specialist</w:t>
+            </w:r>
+          </w:p>
+        </w:tc>
+        <w:tc>
+          <w:tcPr/>
+          <w:p>
+            <w:pPr>
+              <w:pStyle w:val="Compact"/>
+            </w:pPr>
+            <w:r>
+              <w:rPr>
+                <w:rStyle w:val="VerbatimChar"/>
+              </w:rPr>
+              <w:t xml:space="preserve">0913320013</w:t>
+            </w:r>
+          </w:p>
+        </w:tc>
+        <w:tc>
+          <w:tcPr/>
+          <w:p>
+            <w:pPr>
+              <w:pStyle w:val="Compact"/>
+            </w:pPr>
+            <w:r>
+              <w:rPr>
+                <w:rStyle w:val="VerbatimChar"/>
+              </w:rPr>
+              <w:t xml:space="preserve">0000</w:t>
+            </w:r>
+          </w:p>
+        </w:tc>
+        <w:tc>
+          <w:tcPr/>
+          <w:p>
+            <w:pPr>
+              <w:pStyle w:val="Compact"/>
+            </w:pPr>
+            <w:r>
+              <w:t xml:space="preserve">6</w:t>
+            </w:r>
+          </w:p>
+        </w:tc>
+      </w:tr>
+      <w:tr>
+        <w:tc>
+          <w:tcPr/>
+          <w:p>
+            <w:pPr>
+              <w:pStyle w:val="Compact"/>
+            </w:pPr>
+            <w:r>
+              <w:t xml:space="preserve">Analyst</w:t>
+            </w:r>
+          </w:p>
+        </w:tc>
+        <w:tc>
+          <w:tcPr/>
+          <w:p>
+            <w:pPr>
+              <w:pStyle w:val="Compact"/>
+            </w:pPr>
+            <w:r>
+              <w:rPr>
+                <w:rStyle w:val="VerbatimChar"/>
+              </w:rPr>
+              <w:t xml:space="preserve">0913320016</w:t>
+            </w:r>
+          </w:p>
+        </w:tc>
+        <w:tc>
+          <w:tcPr/>
+          <w:p>
+            <w:pPr>
+              <w:pStyle w:val="Compact"/>
+            </w:pPr>
+            <w:r>
+              <w:rPr>
+                <w:rStyle w:val="VerbatimChar"/>
+              </w:rPr>
+              <w:t xml:space="preserve">0000</w:t>
+            </w:r>
+          </w:p>
+        </w:tc>
+        <w:tc>
+          <w:tcPr/>
+          <w:p>
+            <w:pPr>
+              <w:pStyle w:val="Compact"/>
+            </w:pPr>
+            <w:r>
+              <w:t xml:space="preserve">7</w:t>
+            </w:r>
+          </w:p>
+        </w:tc>
+      </w:tr>
+      <w:tr>
+        <w:tc>
+          <w:tcPr/>
+          <w:p>
+            <w:pPr>
+              <w:pStyle w:val="Compact"/>
+            </w:pPr>
+            <w:r>
+              <w:t xml:space="preserve">User</w:t>
+            </w:r>
+          </w:p>
+        </w:tc>
+        <w:tc>
+          <w:tcPr/>
+          <w:p>
+            <w:pPr>
+              <w:pStyle w:val="Compact"/>
+            </w:pPr>
+            <w:r>
+              <w:rPr>
+                <w:rStyle w:val="VerbatimChar"/>
+              </w:rPr>
+              <w:t xml:space="preserve">0913320018</w:t>
+            </w:r>
+            <w:r>
+              <w:t xml:space="preserve">–</w:t>
+            </w:r>
+            <w:r>
+              <w:rPr>
+                <w:rStyle w:val="VerbatimChar"/>
+              </w:rPr>
+              <w:t xml:space="preserve">0913320028</w:t>
+            </w:r>
+          </w:p>
+        </w:tc>
+        <w:tc>
+          <w:tcPr/>
+          <w:p>
+            <w:pPr>
+              <w:pStyle w:val="Compact"/>
+            </w:pPr>
+            <w:r>
+              <w:rPr>
+                <w:rStyle w:val="VerbatimChar"/>
+              </w:rPr>
+              <w:t xml:space="preserve">0000</w:t>
+            </w:r>
+          </w:p>
+        </w:tc>
+        <w:tc>
+          <w:tcPr/>
+          <w:p>
+            <w:pPr>
+              <w:pStyle w:val="Compact"/>
+            </w:pPr>
+            <w:r>
+              <w:t xml:space="preserve">7</w:t>
+            </w:r>
+          </w:p>
+        </w:tc>
+      </w:tr>
+    </w:tbl>
+    <w:p>
+      <w:pPr>
+        <w:pStyle w:val="BodyText"/>
+      </w:pPr>
+      <w:r>
+        <w:t xml:space="preserve">All users have T&amp;C accepted (v1.0), wallet PIN set (</w:t>
+      </w:r>
+      <w:r>
+        <w:rPr>
+          <w:rStyle w:val="VerbatimChar"/>
+        </w:rPr>
+        <w:t xml:space="preserve">0000</w:t>
+      </w:r>
+      <w:r>
+        <w:t xml:space="preserve"> </w:t>
+      </w:r>
+      <w:r>
+        <w:t xml:space="preserve">for users,</w:t>
+      </w:r>
+      <w:r>
+        <w:t xml:space="preserve"> </w:t>
+      </w:r>
+      <w:r>
+        <w:rPr>
+          <w:rStyle w:val="VerbatimChar"/>
+        </w:rPr>
+        <w:t xml:space="preserve">1234</w:t>
+      </w:r>
+      <w:r>
+        <w:t xml:space="preserve"> </w:t>
+      </w:r>
+      <w:r>
+        <w:t xml:space="preserve">for admins).</w:t>
+      </w:r>
+    </w:p>
+    <w:bookmarkEnd w:id="15"/>
+    <w:bookmarkEnd w:id="16"/>
+    <w:bookmarkStart w:id="17" w:name="environment"/>
+    <w:p>
+      <w:pPr>
+        <w:pStyle w:val="Heading2"/>
+      </w:pPr>
+      <w:r>
+        <w:rPr>
+          <w:rStyle w:val="SectionNumber"/>
+        </w:rPr>
+        <w:t xml:space="preserve">1.6</w:t>
+      </w:r>
+      <w:r>
+        <w:tab/>
+      </w:r>
+      <w:r>
+        <w:t xml:space="preserve">Environment</w:t>
+      </w:r>
+    </w:p>
+    <w:p>
+      <w:pPr>
+        <w:pStyle w:val="FirstParagraph"/>
+      </w:pPr>
+      <w:r>
+        <w:t xml:space="preserve">Each service has a</w:t>
+      </w:r>
+      <w:r>
+        <w:t xml:space="preserve"> </w:t>
+      </w:r>
+      <w:r>
+        <w:rPr>
+          <w:rStyle w:val="VerbatimChar"/>
+        </w:rPr>
+        <w:t xml:space="preserve">.env.example</w:t>
+      </w:r>
+      <w:r>
+        <w:t xml:space="preserve">. Copy to</w:t>
+      </w:r>
+      <w:r>
+        <w:t xml:space="preserve"> </w:t>
+      </w:r>
+      <w:r>
+        <w:rPr>
+          <w:rStyle w:val="VerbatimChar"/>
+        </w:rPr>
+        <w:t xml:space="preserve">.env</w:t>
+      </w:r>
+      <w:r>
+        <w:t xml:space="preserve"> </w:t>
+      </w:r>
+      <w:r>
+        <w:t xml:space="preserve">and fill in. Critical vars:</w:t>
+      </w:r>
+    </w:p>
+    <w:tbl>
+      <w:tblPr>
+        <w:tblStyle w:val="Table"/>
+        <w:tblW w:type="pct" w:w="5000"/>
+        <w:tblLayout w:type="fixed"/>
+        <w:tblLook w:firstRow="1" w:lastRow="0" w:firstColumn="0" w:lastColumn="0" w:noHBand="0" w:noVBand="0" w:val="0020"/>
+      </w:tblPr>
+      <w:tblGrid>
+        <w:gridCol w:w="3443"/>
+        <w:gridCol w:w="4476"/>
+      </w:tblGrid>
+      <w:tr>
+        <w:trPr>
+          <w:tblHeader w:val="on"/>
+        </w:trPr>
+        <w:tc>
+          <w:tcPr/>
+          <w:p>
+            <w:pPr>
+              <w:pStyle w:val="Compact"/>
+            </w:pPr>
+            <w:r>
+              <w:t xml:space="preserve">Variable</w:t>
+            </w:r>
+          </w:p>
+        </w:tc>
+        <w:tc>
+          <w:tcPr/>
+          <w:p>
+            <w:pPr>
+              <w:pStyle w:val="Compact"/>
+            </w:pPr>
+            <w:r>
+              <w:t xml:space="preserve">Description</w:t>
+            </w:r>
+          </w:p>
+        </w:tc>
+      </w:tr>
+      <w:tr>
+        <w:tc>
+          <w:tcPr/>
+          <w:p>
+            <w:pPr>
+              <w:pStyle w:val="Compact"/>
+            </w:pPr>
+            <w:r>
+              <w:rPr>
+                <w:rStyle w:val="VerbatimChar"/>
+              </w:rPr>
+              <w:t xml:space="preserve">DATABASE_URL</w:t>
+            </w:r>
+          </w:p>
+        </w:tc>
+        <w:tc>
+          <w:tcPr/>
+          <w:p>
+            <w:pPr>
+              <w:pStyle w:val="Compact"/>
+            </w:pPr>
+            <w:r>
+              <w:t xml:space="preserve">PostgreSQL connection string</w:t>
+            </w:r>
+          </w:p>
+        </w:tc>
+      </w:tr>
+      <w:tr>
+        <w:tc>
+          <w:tcPr/>
+          <w:p>
+            <w:pPr>
+              <w:pStyle w:val="Compact"/>
+            </w:pPr>
+            <w:r>
+              <w:rPr>
+                <w:rStyle w:val="VerbatimChar"/>
+              </w:rPr>
+              <w:t xml:space="preserve">REDIS_URL</w:t>
+            </w:r>
+          </w:p>
+        </w:tc>
+        <w:tc>
+          <w:tcPr/>
+          <w:p>
+            <w:pPr>
+              <w:pStyle w:val="Compact"/>
+            </w:pPr>
+            <w:r>
+              <w:t xml:space="preserve">Redis connection (standalone)</w:t>
+            </w:r>
+          </w:p>
+        </w:tc>
+      </w:tr>
+      <w:tr>
+        <w:tc>
+          <w:tcPr/>
+          <w:p>
+            <w:pPr>
+              <w:pStyle w:val="Compact"/>
+            </w:pPr>
+            <w:r>
+              <w:rPr>
+                <w:rStyle w:val="VerbatimChar"/>
+              </w:rPr>
+              <w:t xml:space="preserve">REDIS_SENTINEL_HOSTS</w:t>
+            </w:r>
+          </w:p>
+        </w:tc>
+        <w:tc>
+          <w:tcPr/>
+          <w:p>
+            <w:pPr>
+              <w:pStyle w:val="Compact"/>
+            </w:pPr>
+            <w:r>
+              <w:t xml:space="preserve">Redis Sentinel (HA) — comma-separated</w:t>
+            </w:r>
+            <w:r>
+              <w:t xml:space="preserve"> </w:t>
+            </w:r>
+            <w:r>
+              <w:rPr>
+                <w:rStyle w:val="VerbatimChar"/>
+              </w:rPr>
+              <w:t xml:space="preserve">host:port</w:t>
+            </w:r>
+          </w:p>
+        </w:tc>
+      </w:tr>
+      <w:tr>
+        <w:tc>
+          <w:tcPr/>
+          <w:p>
+            <w:pPr>
+              <w:pStyle w:val="Compact"/>
+            </w:pPr>
+            <w:r>
+              <w:rPr>
+                <w:rStyle w:val="VerbatimChar"/>
+              </w:rPr>
+              <w:t xml:space="preserve">REDIS_SENTINEL_MASTER_NAME</w:t>
+            </w:r>
+          </w:p>
+        </w:tc>
+        <w:tc>
+          <w:tcPr/>
+          <w:p>
+            <w:pPr>
+              <w:pStyle w:val="Compact"/>
+            </w:pPr>
+            <w:r>
+              <w:t xml:space="preserve">Redis Sentinel master name</w:t>
+            </w:r>
+          </w:p>
+        </w:tc>
+      </w:tr>
+      <w:tr>
+        <w:tc>
+          <w:tcPr/>
+          <w:p>
+            <w:pPr>
+              <w:pStyle w:val="Compact"/>
+            </w:pPr>
+            <w:r>
+              <w:rPr>
+                <w:rStyle w:val="VerbatimChar"/>
+              </w:rPr>
+              <w:t xml:space="preserve">REDIS_CLUSTER_NODES</w:t>
+            </w:r>
+          </w:p>
+        </w:tc>
+        <w:tc>
+          <w:tcPr/>
+          <w:p>
+            <w:pPr>
+              <w:pStyle w:val="Compact"/>
+            </w:pPr>
+            <w:r>
+              <w:t xml:space="preserve">Redis Cluster (sharding) — comma-separated</w:t>
+            </w:r>
+            <w:r>
+              <w:t xml:space="preserve"> </w:t>
+            </w:r>
+            <w:r>
+              <w:rPr>
+                <w:rStyle w:val="VerbatimChar"/>
+              </w:rPr>
+              <w:t xml:space="preserve">host:port</w:t>
+            </w:r>
+          </w:p>
+        </w:tc>
+      </w:tr>
+      <w:tr>
+        <w:tc>
+          <w:tcPr/>
+          <w:p>
+            <w:pPr>
+              <w:pStyle w:val="Compact"/>
+            </w:pPr>
+            <w:r>
+              <w:rPr>
+                <w:rStyle w:val="VerbatimChar"/>
+              </w:rPr>
+              <w:t xml:space="preserve">JWT_SECRET</w:t>
+            </w:r>
+          </w:p>
+        </w:tc>
+        <w:tc>
+          <w:tcPr/>
+          <w:p>
+            <w:pPr>
+              <w:pStyle w:val="Compact"/>
+            </w:pPr>
+            <w:r>
+              <w:t xml:space="preserve">JWT signing secret (must NOT be</w:t>
+            </w:r>
+            <w:r>
+              <w:t xml:space="preserve"> </w:t>
+            </w:r>
+            <w:r>
+              <w:rPr>
+                <w:rStyle w:val="VerbatimChar"/>
+              </w:rPr>
+              <w:t xml:space="preserve">takelow-jwt-secret</w:t>
+            </w:r>
+            <w:r>
+              <w:t xml:space="preserve">)</w:t>
+            </w:r>
+          </w:p>
+        </w:tc>
+      </w:tr>
+      <w:tr>
+        <w:tc>
+          <w:tcPr/>
+          <w:p>
+            <w:pPr>
+              <w:pStyle w:val="Compact"/>
+            </w:pPr>
+            <w:r>
+              <w:rPr>
+                <w:rStyle w:val="VerbatimChar"/>
+              </w:rPr>
+              <w:t xml:space="preserve">JWT_REFRESH_SECRET</w:t>
+            </w:r>
+          </w:p>
+        </w:tc>
+        <w:tc>
+          <w:tcPr/>
+          <w:p>
+            <w:pPr>
+              <w:pStyle w:val="Compact"/>
+            </w:pPr>
+            <w:r>
+              <w:t xml:space="preserve">JWT refresh token secret</w:t>
+            </w:r>
+          </w:p>
+        </w:tc>
+      </w:tr>
+      <w:tr>
+        <w:tc>
+          <w:tcPr/>
+          <w:p>
+            <w:pPr>
+              <w:pStyle w:val="Compact"/>
+            </w:pPr>
+            <w:r>
+              <w:rPr>
+                <w:rStyle w:val="VerbatimChar"/>
+              </w:rPr>
+              <w:t xml:space="preserve">INTERNAL_API_KEY</w:t>
+            </w:r>
+          </w:p>
+        </w:tc>
+        <w:tc>
+          <w:tcPr/>
+          <w:p>
+            <w:pPr>
+              <w:pStyle w:val="Compact"/>
+            </w:pPr>
+            <w:r>
+              <w:t xml:space="preserve">Service-to-service authentication</w:t>
+            </w:r>
+          </w:p>
+        </w:tc>
+      </w:tr>
+      <w:tr>
+        <w:tc>
+          <w:tcPr/>
+          <w:p>
+            <w:pPr>
+              <w:pStyle w:val="Compact"/>
+            </w:pPr>
+            <w:r>
+              <w:rPr>
+                <w:rStyle w:val="VerbatimChar"/>
+              </w:rPr>
+              <w:t xml:space="preserve">CORS_ORIGINS</w:t>
+            </w:r>
+          </w:p>
+        </w:tc>
+        <w:tc>
+          <w:tcPr/>
+          <w:p>
+            <w:pPr>
+              <w:pStyle w:val="Compact"/>
+            </w:pPr>
+            <w:r>
+              <w:t xml:space="preserve">Comma-separated allowed origins</w:t>
+            </w:r>
+          </w:p>
+        </w:tc>
+      </w:tr>
+      <w:tr>
+        <w:tc>
+          <w:tcPr/>
+          <w:p>
+            <w:pPr>
+              <w:pStyle w:val="Compact"/>
+            </w:pPr>
+            <w:r>
+              <w:rPr>
+                <w:rStyle w:val="VerbatimChar"/>
+              </w:rPr>
+              <w:t xml:space="preserve">SIKINA_*</w:t>
+            </w:r>
+          </w:p>
+        </w:tc>
+        <w:tc>
+          <w:tcPr/>
+          <w:p>
+            <w:pPr>
+              <w:pStyle w:val="Compact"/>
+            </w:pPr>
+            <w:r>
+              <w:t xml:space="preserve">SikinaPay payment gateway config</w:t>
+            </w:r>
+          </w:p>
+        </w:tc>
+      </w:tr>
+      <w:tr>
+        <w:tc>
+          <w:tcPr/>
+          <w:p>
+            <w:pPr>
+              <w:pStyle w:val="Compact"/>
+            </w:pPr>
+            <w:r>
+              <w:rPr>
+                <w:rStyle w:val="VerbatimChar"/>
+              </w:rPr>
+              <w:t xml:space="preserve">AWASH_*</w:t>
+            </w:r>
+          </w:p>
+        </w:tc>
+        <w:tc>
+          <w:tcPr/>
+          <w:p>
+            <w:pPr>
+              <w:pStyle w:val="Compact"/>
+            </w:pPr>
+            <w:r>
+              <w:t xml:space="preserve">Awash Bank payment gateway config</w:t>
+            </w:r>
+          </w:p>
+        </w:tc>
+      </w:tr>
+      <w:tr>
+        <w:tc>
+          <w:tcPr/>
+          <w:p>
+            <w:pPr>
+              <w:pStyle w:val="Compact"/>
+            </w:pPr>
+            <w:r>
+              <w:rPr>
+                <w:rStyle w:val="VerbatimChar"/>
+              </w:rPr>
+              <w:t xml:space="preserve">SMS_API_KEY</w:t>
+            </w:r>
+          </w:p>
+        </w:tc>
+        <w:tc>
+          <w:tcPr/>
+          <w:p>
+            <w:pPr>
+              <w:pStyle w:val="Compact"/>
+            </w:pPr>
+            <w:r>
+              <w:t xml:space="preserve">SMS Ethiopia API key</w:t>
+            </w:r>
+          </w:p>
+        </w:tc>
+      </w:tr>
+    </w:tbl>
+    <w:bookmarkEnd w:id="17"/>
+    <w:bookmarkStart w:id="18" w:name="testing-verification"/>
+    <w:p>
+      <w:pPr>
+        <w:pStyle w:val="Heading2"/>
+      </w:pPr>
+      <w:r>
+        <w:rPr>
+          <w:rStyle w:val="SectionNumber"/>
+        </w:rPr>
+        <w:t xml:space="preserve">1.7</w:t>
+      </w:r>
+      <w:r>
+        <w:tab/>
+      </w:r>
+      <w:r>
+        <w:t xml:space="preserve">Testing &amp; Verification</w:t>
+      </w:r>
+    </w:p>
+    <w:p>
+      <w:pPr>
+        <w:pStyle w:val="SourceCode"/>
+      </w:pPr>
+      <w:r>
+        <w:rPr>
+          <w:rStyle w:val="CommentTok"/>
+        </w:rPr>
+        <w:t xml:space="preserve"># Backend tests (per service)</w:t>
+      </w:r>
+      <w:r>
+        <w:br/>
+      </w:r>
+      <w:r>
+        <w:rPr>
+          <w:rStyle w:val="BuiltInTok"/>
+        </w:rPr>
+        <w:t xml:space="preserve">cd</w:t>
+      </w:r>
+      <w:r>
+        <w:rPr>
+          <w:rStyle w:val="NormalTok"/>
+        </w:rPr>
+        <w:t xml:space="preserve"> identity-service </w:t>
+      </w:r>
+      <w:r>
+        <w:rPr>
+          <w:rStyle w:val="KeywordTok"/>
+        </w:rPr>
+        <w:t xml:space="preserve">&amp;&amp;</w:t>
+      </w:r>
+      <w:r>
+        <w:rPr>
+          <w:rStyle w:val="NormalTok"/>
+        </w:rPr>
+        <w:t xml:space="preserve"> </w:t>
+      </w:r>
+      <w:r>
+        <w:rPr>
+          <w:rStyle w:val="ExtensionTok"/>
+        </w:rPr>
+        <w:t xml:space="preserve">npm</w:t>
+      </w:r>
+      <w:r>
+        <w:rPr>
+          <w:rStyle w:val="NormalTok"/>
+        </w:rPr>
+        <w:t xml:space="preserve"> test      </w:t>
+      </w:r>
+      <w:r>
+        <w:rPr>
+          <w:rStyle w:val="CommentTok"/>
+        </w:rPr>
+        <w:t xml:space="preserve"># 8 tests</w:t>
+      </w:r>
+      <w:r>
+        <w:br/>
+      </w:r>
+      <w:r>
+        <w:rPr>
+          <w:rStyle w:val="BuiltInTok"/>
+        </w:rPr>
+        <w:t xml:space="preserve">cd</w:t>
+      </w:r>
+      <w:r>
+        <w:rPr>
+          <w:rStyle w:val="NormalTok"/>
+        </w:rPr>
+        <w:t xml:space="preserve"> auction-engine </w:t>
+      </w:r>
+      <w:r>
+        <w:rPr>
+          <w:rStyle w:val="KeywordTok"/>
+        </w:rPr>
+        <w:t xml:space="preserve">&amp;&amp;</w:t>
+      </w:r>
+      <w:r>
+        <w:rPr>
+          <w:rStyle w:val="NormalTok"/>
+        </w:rPr>
+        <w:t xml:space="preserve"> </w:t>
+      </w:r>
+      <w:r>
+        <w:rPr>
+          <w:rStyle w:val="ExtensionTok"/>
+        </w:rPr>
+        <w:t xml:space="preserve">npm</w:t>
+      </w:r>
+      <w:r>
+        <w:rPr>
+          <w:rStyle w:val="NormalTok"/>
+        </w:rPr>
+        <w:t xml:space="preserve"> test        </w:t>
+      </w:r>
+      <w:r>
+        <w:rPr>
+          <w:rStyle w:val="CommentTok"/>
+        </w:rPr>
+        <w:t xml:space="preserve"># 54 tests</w:t>
+      </w:r>
+      <w:r>
+        <w:br/>
+      </w:r>
+      <w:r>
+        <w:rPr>
+          <w:rStyle w:val="BuiltInTok"/>
+        </w:rPr>
+        <w:t xml:space="preserve">cd</w:t>
+      </w:r>
+      <w:r>
+        <w:rPr>
+          <w:rStyle w:val="NormalTok"/>
+        </w:rPr>
+        <w:t xml:space="preserve"> query-service </w:t>
+      </w:r>
+      <w:r>
+        <w:rPr>
+          <w:rStyle w:val="KeywordTok"/>
+        </w:rPr>
+        <w:t xml:space="preserve">&amp;&amp;</w:t>
+      </w:r>
+      <w:r>
+        <w:rPr>
+          <w:rStyle w:val="NormalTok"/>
+        </w:rPr>
+        <w:t xml:space="preserve"> </w:t>
+      </w:r>
+      <w:r>
+        <w:rPr>
+          <w:rStyle w:val="ExtensionTok"/>
+        </w:rPr>
+        <w:t xml:space="preserve">npm</w:t>
+      </w:r>
+      <w:r>
+        <w:rPr>
+          <w:rStyle w:val="NormalTok"/>
+        </w:rPr>
+        <w:t xml:space="preserve"> test         </w:t>
+      </w:r>
+      <w:r>
+        <w:rPr>
+          <w:rStyle w:val="CommentTok"/>
+        </w:rPr>
+        <w:t xml:space="preserve"># 3 tests</w:t>
+      </w:r>
+      <w:r>
+        <w:br/>
+      </w:r>
+      <w:r>
+        <w:br/>
+      </w:r>
+      <w:r>
+        <w:rPr>
+          <w:rStyle w:val="CommentTok"/>
+        </w:rPr>
+        <w:t xml:space="preserve"># Type checking (all 5 projects)</w:t>
+      </w:r>
+      <w:r>
+        <w:br/>
+      </w:r>
+      <w:r>
+        <w:rPr>
+          <w:rStyle w:val="ExtensionTok"/>
+        </w:rPr>
+        <w:t xml:space="preserve">npx</w:t>
+      </w:r>
+      <w:r>
+        <w:rPr>
+          <w:rStyle w:val="NormalTok"/>
+        </w:rPr>
+        <w:t xml:space="preserve"> tsc </w:t>
+      </w:r>
+      <w:r>
+        <w:rPr>
+          <w:rStyle w:val="AttributeTok"/>
+        </w:rPr>
+        <w:t xml:space="preserve">--noEmit</w:t>
+      </w:r>
+      <w:r>
+        <w:br/>
+      </w:r>
+      <w:r>
+        <w:br/>
+      </w:r>
+      <w:r>
+        <w:rPr>
+          <w:rStyle w:val="CommentTok"/>
+        </w:rPr>
+        <w:t xml:space="preserve"># Prisma commands (per service)</w:t>
+      </w:r>
+      <w:r>
+        <w:br/>
+      </w:r>
+      <w:r>
+        <w:rPr>
+          <w:rStyle w:val="ExtensionTok"/>
+        </w:rPr>
+        <w:t xml:space="preserve">npm</w:t>
+      </w:r>
+      <w:r>
+        <w:rPr>
+          <w:rStyle w:val="NormalTok"/>
+        </w:rPr>
+        <w:t xml:space="preserve"> run prisma:generate              </w:t>
+      </w:r>
+      <w:r>
+        <w:rPr>
+          <w:rStyle w:val="CommentTok"/>
+        </w:rPr>
+        <w:t xml:space="preserve"># Generate Prisma client</w:t>
+      </w:r>
+      <w:r>
+        <w:br/>
+      </w:r>
+      <w:r>
+        <w:rPr>
+          <w:rStyle w:val="ExtensionTok"/>
+        </w:rPr>
+        <w:t xml:space="preserve">npm</w:t>
+      </w:r>
+      <w:r>
+        <w:rPr>
+          <w:rStyle w:val="NormalTok"/>
+        </w:rPr>
+        <w:t xml:space="preserve"> run prisma:migrate               </w:t>
+      </w:r>
+      <w:r>
+        <w:rPr>
+          <w:rStyle w:val="CommentTok"/>
+        </w:rPr>
+        <w:t xml:space="preserve"># Create and apply migration</w:t>
+      </w:r>
+      <w:r>
+        <w:br/>
+      </w:r>
+      <w:r>
+        <w:rPr>
+          <w:rStyle w:val="ExtensionTok"/>
+        </w:rPr>
+        <w:t xml:space="preserve">npm</w:t>
+      </w:r>
+      <w:r>
+        <w:rPr>
+          <w:rStyle w:val="NormalTok"/>
+        </w:rPr>
+        <w:t xml:space="preserve"> run prisma:deploy                </w:t>
+      </w:r>
+      <w:r>
+        <w:rPr>
+          <w:rStyle w:val="CommentTok"/>
+        </w:rPr>
+        <w:t xml:space="preserve"># Deploy migrations (production)</w:t>
+      </w:r>
+      <w:r>
+        <w:br/>
+      </w:r>
+      <w:r>
+        <w:rPr>
+          <w:rStyle w:val="ExtensionTok"/>
+        </w:rPr>
+        <w:t xml:space="preserve">npm</w:t>
+      </w:r>
+      <w:r>
+        <w:rPr>
+          <w:rStyle w:val="NormalTok"/>
+        </w:rPr>
+        <w:t xml:space="preserve"> run prisma:studio                </w:t>
+      </w:r>
+      <w:r>
+        <w:rPr>
+          <w:rStyle w:val="CommentTok"/>
+        </w:rPr>
+        <w:t xml:space="preserve"># Open Prisma Studio GUI</w:t>
+      </w:r>
+    </w:p>
+    <w:bookmarkEnd w:id="18"/>
+    <w:bookmarkStart w:id="19" w:name="project-layout"/>
+    <w:p>
+      <w:pPr>
+        <w:pStyle w:val="Heading2"/>
+      </w:pPr>
+      <w:r>
+        <w:rPr>
+          <w:rStyle w:val="SectionNumber"/>
+        </w:rPr>
+        <w:t xml:space="preserve">1.8</w:t>
+      </w:r>
+      <w:r>
+        <w:tab/>
+      </w:r>
+      <w:r>
+        <w:t xml:space="preserve">Project Layout</w:t>
+      </w:r>
+    </w:p>
+    <w:p>
+      <w:pPr>
+        <w:pStyle w:val="SourceCode"/>
+      </w:pPr>
+      <w:r>
+        <w:rPr>
+          <w:rStyle w:val="VerbatimChar"/>
+        </w:rPr>
+        <w:t xml:space="preserve">auction-engine/        NestJS bidding + winner + payments + product approval</w:t>
+      </w:r>
+      <w:r>
+        <w:br/>
+      </w:r>
+      <w:r>
+        <w:rPr>
+          <w:rStyle w:val="VerbatimChar"/>
+        </w:rPr>
+        <w:t xml:space="preserve">identity-service/      NestJS auth (Better-auth) + wallet + RBAC (CASL) + disputes</w:t>
+      </w:r>
+      <w:r>
+        <w:br/>
+      </w:r>
+      <w:r>
+        <w:rPr>
+          <w:rStyle w:val="VerbatimChar"/>
+        </w:rPr>
+        <w:t xml:space="preserve">query-service/         NestJS read APIs + caching + analytics + settlement + audit viewer</w:t>
+      </w:r>
+      <w:r>
+        <w:br/>
+      </w:r>
+      <w:r>
+        <w:rPr>
+          <w:rStyle w:val="VerbatimChar"/>
+        </w:rPr>
+        <w:t xml:space="preserve">takelow-web/           React + Vite + Tailwind</w:t>
+      </w:r>
+      <w:r>
+        <w:br/>
+      </w:r>
+      <w:r>
+        <w:rPr>
+          <w:rStyle w:val="VerbatimChar"/>
+        </w:rPr>
+        <w:t xml:space="preserve">takelow-app/           React Native (Expo)</w:t>
+      </w:r>
+      <w:r>
+        <w:br/>
+      </w:r>
+      <w:r>
+        <w:rPr>
+          <w:rStyle w:val="VerbatimChar"/>
+        </w:rPr>
+        <w:t xml:space="preserve">database/migrations/   40 raw SQL migrations (idempotent, tracked)</w:t>
+      </w:r>
+      <w:r>
+        <w:br/>
+      </w:r>
+      <w:r>
+        <w:rPr>
+          <w:rStyle w:val="VerbatimChar"/>
+        </w:rPr>
+        <w:t xml:space="preserve">k8s/                   Kubernetes manifests + backup CronJobs</w:t>
+      </w:r>
+      <w:r>
+        <w:br/>
+      </w:r>
+      <w:r>
+        <w:rPr>
+          <w:rStyle w:val="VerbatimChar"/>
+        </w:rPr>
+        <w:t xml:space="preserve">scripts/               dev/seed/migrate/backup/restore helpers</w:t>
+      </w:r>
+      <w:r>
+        <w:br/>
+      </w:r>
+      <w:r>
+        <w:rPr>
+          <w:rStyle w:val="VerbatimChar"/>
+        </w:rPr>
+        <w:t xml:space="preserve">load-tests/            k6 bid-flood scenarios</w:t>
+      </w:r>
+      <w:r>
+        <w:br/>
+      </w:r>
+      <w:r>
+        <w:rPr>
+          <w:rStyle w:val="VerbatimChar"/>
+        </w:rPr>
+        <w:t xml:space="preserve">docs/                  Enterprise documentation (SRS, SDD, TTD/LLD, User Guide)</w:t>
+      </w:r>
+    </w:p>
+    <w:bookmarkEnd w:id="19"/>
+    <w:bookmarkStart w:id="20" w:name="database-migrations"/>
+    <w:p>
+      <w:pPr>
+        <w:pStyle w:val="Heading2"/>
+      </w:pPr>
+      <w:r>
+        <w:rPr>
+          <w:rStyle w:val="SectionNumber"/>
+        </w:rPr>
+        <w:t xml:space="preserve">1.9</w:t>
+      </w:r>
+      <w:r>
+        <w:tab/>
+      </w:r>
+      <w:r>
+        <w:t xml:space="preserve">Database Migrations</w:t>
+      </w:r>
+    </w:p>
+    <w:p>
+      <w:pPr>
+        <w:pStyle w:val="FirstParagraph"/>
+      </w:pPr>
+      <w:r>
+        <w:t xml:space="preserve">40 idempotent SQL migrations tracked in</w:t>
+      </w:r>
+      <w:r>
+        <w:t xml:space="preserve"> </w:t>
+      </w:r>
+      <w:r>
+        <w:rPr>
+          <w:rStyle w:val="VerbatimChar"/>
+        </w:rPr>
+        <w:t xml:space="preserve">schema_migrations</w:t>
+      </w:r>
+      <w:r>
+        <w:t xml:space="preserve">:</w:t>
+      </w:r>
+    </w:p>
+    <w:tbl>
+      <w:tblPr>
+        <w:tblStyle w:val="Table"/>
+        <w:tblW w:type="pct" w:w="5000"/>
+        <w:tblLayout w:type="fixed"/>
+        <w:tblLook w:firstRow="1" w:lastRow="0" w:firstColumn="0" w:lastColumn="0" w:noHBand="0" w:noVBand="0" w:val="0020"/>
+      </w:tblPr>
+      <w:tblGrid>
+        <w:gridCol w:w="2772"/>
+        <w:gridCol w:w="5148"/>
+      </w:tblGrid>
+      <w:tr>
+        <w:trPr>
+          <w:tblHeader w:val="on"/>
+        </w:trPr>
+        <w:tc>
+          <w:tcPr/>
+          <w:p>
+            <w:pPr>
+              <w:pStyle w:val="Compact"/>
+            </w:pPr>
+            <w:r>
+              <w:t xml:space="preserve">Range</w:t>
+            </w:r>
+          </w:p>
+        </w:tc>
+        <w:tc>
+          <w:tcPr/>
+          <w:p>
+            <w:pPr>
+              <w:pStyle w:val="Compact"/>
+            </w:pPr>
+            <w:r>
+              <w:t xml:space="preserve">Description</w:t>
+            </w:r>
+          </w:p>
+        </w:tc>
+      </w:tr>
+      <w:tr>
+        <w:tc>
+          <w:tcPr/>
+          <w:p>
+            <w:pPr>
+              <w:pStyle w:val="Compact"/>
+            </w:pPr>
+            <w:r>
+              <w:t xml:space="preserve">000–033</w:t>
+            </w:r>
+          </w:p>
+        </w:tc>
+        <w:tc>
+          <w:tcPr/>
+          <w:p>
+            <w:pPr>
+              <w:pStyle w:val="Compact"/>
+            </w:pPr>
+            <w:r>
+              <w:t xml:space="preserve">Core schema (users, products, auctions, bids, payments, winners, audit logs, permissions)</w:t>
+            </w:r>
+          </w:p>
+        </w:tc>
+      </w:tr>
+      <w:tr>
+        <w:tc>
+          <w:tcPr/>
+          <w:p>
+            <w:pPr>
+              <w:pStyle w:val="Compact"/>
+            </w:pPr>
+            <w:r>
+              <w:t xml:space="preserve">034</w:t>
+            </w:r>
+          </w:p>
+        </w:tc>
+        <w:tc>
+          <w:tcPr/>
+          <w:p>
+            <w:pPr>
+              <w:pStyle w:val="Compact"/>
+            </w:pPr>
+            <w:r>
+              <w:t xml:space="preserve">Citus distribution for production (auto-skips on local dev)</w:t>
+            </w:r>
+          </w:p>
+        </w:tc>
+      </w:tr>
+      <w:tr>
+        <w:tc>
+          <w:tcPr/>
+          <w:p>
+            <w:pPr>
+              <w:pStyle w:val="Compact"/>
+            </w:pPr>
+            <w:r>
+              <w:t xml:space="preserve">035</w:t>
+            </w:r>
+          </w:p>
+        </w:tc>
+        <w:tc>
+          <w:tcPr/>
+          <w:p>
+            <w:pPr>
+              <w:pStyle w:val="Compact"/>
+            </w:pPr>
+            <w:r>
+              <w:t xml:space="preserve">T&amp;C acceptance columns</w:t>
+            </w:r>
+          </w:p>
+        </w:tc>
+      </w:tr>
+      <w:tr>
+        <w:tc>
+          <w:tcPr/>
+          <w:p>
+            <w:pPr>
+              <w:pStyle w:val="Compact"/>
+            </w:pPr>
+            <w:r>
+              <w:t xml:space="preserve">036</w:t>
+            </w:r>
+          </w:p>
+        </w:tc>
+        <w:tc>
+          <w:tcPr/>
+          <w:p>
+            <w:pPr>
+              <w:pStyle w:val="Compact"/>
+            </w:pPr>
+            <w:r>
+              <w:t xml:space="preserve">Product approval workflow columns</w:t>
+            </w:r>
+          </w:p>
+        </w:tc>
+      </w:tr>
+      <w:tr>
+        <w:tc>
+          <w:tcPr/>
+          <w:p>
+            <w:pPr>
+              <w:pStyle w:val="Compact"/>
+            </w:pPr>
+            <w:r>
+              <w:t xml:space="preserve">037</w:t>
+            </w:r>
+          </w:p>
+        </w:tc>
+        <w:tc>
+          <w:tcPr/>
+          <w:p>
+            <w:pPr>
+              <w:pStyle w:val="Compact"/>
+            </w:pPr>
+            <w:r>
+              <w:t xml:space="preserve">T&amp;C version tracking</w:t>
+            </w:r>
+          </w:p>
+        </w:tc>
+      </w:tr>
+      <w:tr>
+        <w:tc>
+          <w:tcPr/>
+          <w:p>
+            <w:pPr>
+              <w:pStyle w:val="Compact"/>
+            </w:pPr>
+            <w:r>
+              <w:t xml:space="preserve">038</w:t>
+            </w:r>
+          </w:p>
+        </w:tc>
+        <w:tc>
+          <w:tcPr/>
+          <w:p>
+            <w:pPr>
+              <w:pStyle w:val="Compact"/>
+            </w:pPr>
+            <w:r>
+              <w:t xml:space="preserve">Dispute resolution table</w:t>
+            </w:r>
+          </w:p>
+        </w:tc>
+      </w:tr>
+      <w:tr>
+        <w:tc>
+          <w:tcPr/>
+          <w:p>
+            <w:pPr>
+              <w:pStyle w:val="Compact"/>
+            </w:pPr>
+            <w:r>
+              <w:t xml:space="preserve">039</w:t>
+            </w:r>
+          </w:p>
+        </w:tc>
+        <w:tc>
+          <w:tcPr/>
+          <w:p>
+            <w:pPr>
+              <w:pStyle w:val="Compact"/>
+            </w:pPr>
+            <w:r>
+              <w:t xml:space="preserve">RBAC role hierarchy (divisions, departments, sections, permission overrides, access decisions)</w:t>
+            </w:r>
+          </w:p>
+        </w:tc>
+      </w:tr>
+    </w:tbl>
+    <w:bookmarkEnd w:id="20"/>
+    <w:bookmarkStart w:id="28" w:name="key-features"/>
+    <w:p>
+      <w:pPr>
+        <w:pStyle w:val="Heading2"/>
+      </w:pPr>
+      <w:r>
+        <w:rPr>
+          <w:rStyle w:val="SectionNumber"/>
+        </w:rPr>
+        <w:t xml:space="preserve">1.10</w:t>
+      </w:r>
+      <w:r>
+        <w:tab/>
+      </w:r>
+      <w:r>
+        <w:t xml:space="preserve">Key Features</w:t>
+      </w:r>
+    </w:p>
+    <w:bookmarkStart w:id="21" w:name="core-platform"/>
+    <w:p>
+      <w:pPr>
+        <w:pStyle w:val="Heading3"/>
+      </w:pPr>
+      <w:r>
+        <w:rPr>
+          <w:rStyle w:val="SectionNumber"/>
+        </w:rPr>
+        <w:t xml:space="preserve">1.10.1</w:t>
+      </w:r>
+      <w:r>
+        <w:tab/>
+      </w:r>
+      <w:r>
+        <w:t xml:space="preserve">Core Platform</w:t>
       </w:r>
     </w:p>
     <w:p>
@@ -794,40 +3079,17 @@
         </w:numPr>
       </w:pPr>
       <w:r>
-        <w:t xml:space="preserve">Users:</w:t>
-      </w:r>
-      <w:r>
-        <w:t xml:space="preserve"> </w:t>
-      </w:r>
-      <w:r>
-        <w:rPr>
-          <w:rStyle w:val="VerbatimChar"/>
-        </w:rPr>
-        <w:t xml:space="preserve">0913320001</w:t>
-      </w:r>
-      <w:r>
-        <w:t xml:space="preserve">–</w:t>
-      </w:r>
-      <w:r>
-        <w:rPr>
-          <w:rStyle w:val="VerbatimChar"/>
-        </w:rPr>
-        <w:t xml:space="preserve">0913320028</w:t>
-      </w:r>
-      <w:r>
-        <w:t xml:space="preserve">, password</w:t>
-      </w:r>
-      <w:r>
-        <w:t xml:space="preserve"> </w:t>
-      </w:r>
-      <w:r>
-        <w:rPr>
-          <w:rStyle w:val="VerbatimChar"/>
-        </w:rPr>
-        <w:t xml:space="preserve">0000</w:t>
-      </w:r>
-      <w:r>
-        <w:t xml:space="preserve">, wallet 100 ETB</w:t>
+        <w:rPr>
+          <w:b/>
+          <w:bCs/>
+        </w:rPr>
+        <w:t xml:space="preserve">Lowest Unique Bid (LUB)</w:t>
+      </w:r>
+      <w:r>
+        <w:t xml:space="preserve"> </w:t>
+      </w:r>
+      <w:r>
+        <w:t xml:space="preserve">auction mechanism with Redis ZSETs</w:t>
       </w:r>
     </w:p>
     <w:p>
@@ -839,7 +3101,967 @@
         </w:numPr>
       </w:pPr>
       <w:r>
-        <w:t xml:space="preserve">Admins:</w:t>
+        <w:rPr>
+          <w:b/>
+          <w:bCs/>
+        </w:rPr>
+        <w:t xml:space="preserve">Real-time bidding</w:t>
+      </w:r>
+      <w:r>
+        <w:t xml:space="preserve"> </w:t>
+      </w:r>
+      <w:r>
+        <w:t xml:space="preserve">via Socket.io with Redis adapter for horizontal scaling</w:t>
+      </w:r>
+    </w:p>
+    <w:p>
+      <w:pPr>
+        <w:pStyle w:val="Compact"/>
+        <w:numPr>
+          <w:ilvl w:val="0"/>
+          <w:numId w:val="1001"/>
+        </w:numPr>
+      </w:pPr>
+      <w:r>
+        <w:rPr>
+          <w:b/>
+          <w:bCs/>
+        </w:rPr>
+        <w:t xml:space="preserve">AES-256-GCM encryption</w:t>
+      </w:r>
+      <w:r>
+        <w:t xml:space="preserve"> </w:t>
+      </w:r>
+      <w:r>
+        <w:t xml:space="preserve">for bid amounts at rest (closed auctions)</w:t>
+      </w:r>
+    </w:p>
+    <w:p>
+      <w:pPr>
+        <w:pStyle w:val="Compact"/>
+        <w:numPr>
+          <w:ilvl w:val="0"/>
+          <w:numId w:val="1001"/>
+        </w:numPr>
+      </w:pPr>
+      <w:r>
+        <w:rPr>
+          <w:b/>
+          <w:bCs/>
+        </w:rPr>
+        <w:t xml:space="preserve">BullMQ batch persistence</w:t>
+      </w:r>
+      <w:r>
+        <w:t xml:space="preserve"> </w:t>
+      </w:r>
+      <w:r>
+        <w:t xml:space="preserve">for high-throughput bid processing</w:t>
+      </w:r>
+    </w:p>
+    <w:p>
+      <w:pPr>
+        <w:pStyle w:val="Compact"/>
+        <w:numPr>
+          <w:ilvl w:val="0"/>
+          <w:numId w:val="1001"/>
+        </w:numPr>
+      </w:pPr>
+      <w:r>
+        <w:rPr>
+          <w:b/>
+          <w:bCs/>
+        </w:rPr>
+        <w:t xml:space="preserve">Fair-play extensions</w:t>
+      </w:r>
+      <w:r>
+        <w:t xml:space="preserve"> </w:t>
+      </w:r>
+      <w:r>
+        <w:t xml:space="preserve">(24h extension if min bids not met or no unique bids)</w:t>
+      </w:r>
+    </w:p>
+    <w:bookmarkEnd w:id="21"/>
+    <w:bookmarkStart w:id="22" w:name="authentication-authorization"/>
+    <w:p>
+      <w:pPr>
+        <w:pStyle w:val="Heading3"/>
+      </w:pPr>
+      <w:r>
+        <w:rPr>
+          <w:rStyle w:val="SectionNumber"/>
+        </w:rPr>
+        <w:t xml:space="preserve">1.10.2</w:t>
+      </w:r>
+      <w:r>
+        <w:tab/>
+      </w:r>
+      <w:r>
+        <w:t xml:space="preserve">Authentication &amp; Authorization</w:t>
+      </w:r>
+    </w:p>
+    <w:p>
+      <w:pPr>
+        <w:pStyle w:val="Compact"/>
+        <w:numPr>
+          <w:ilvl w:val="0"/>
+          <w:numId w:val="1002"/>
+        </w:numPr>
+      </w:pPr>
+      <w:r>
+        <w:rPr>
+          <w:b/>
+          <w:bCs/>
+        </w:rPr>
+        <w:t xml:space="preserve">Better-auth</w:t>
+      </w:r>
+      <w:r>
+        <w:t xml:space="preserve"> </w:t>
+      </w:r>
+      <w:r>
+        <w:t xml:space="preserve">with Prisma adapter (identity-service)</w:t>
+      </w:r>
+    </w:p>
+    <w:p>
+      <w:pPr>
+        <w:pStyle w:val="Compact"/>
+        <w:numPr>
+          <w:ilvl w:val="0"/>
+          <w:numId w:val="1002"/>
+        </w:numPr>
+      </w:pPr>
+      <w:r>
+        <w:rPr>
+          <w:b/>
+          <w:bCs/>
+        </w:rPr>
+        <w:t xml:space="preserve">JwtAuthGuard</w:t>
+      </w:r>
+      <w:r>
+        <w:t xml:space="preserve"> </w:t>
+      </w:r>
+      <w:r>
+        <w:t xml:space="preserve">for token verification (auction-engine, query-service)</w:t>
+      </w:r>
+    </w:p>
+    <w:p>
+      <w:pPr>
+        <w:pStyle w:val="Compact"/>
+        <w:numPr>
+          <w:ilvl w:val="0"/>
+          <w:numId w:val="1002"/>
+        </w:numPr>
+      </w:pPr>
+      <w:r>
+        <w:rPr>
+          <w:b/>
+          <w:bCs/>
+        </w:rPr>
+        <w:t xml:space="preserve">CASL RBAC</w:t>
+      </w:r>
+      <w:r>
+        <w:t xml:space="preserve"> </w:t>
+      </w:r>
+      <w:r>
+        <w:t xml:space="preserve">with 9 enterprise roles and granular permissions</w:t>
+      </w:r>
+    </w:p>
+    <w:p>
+      <w:pPr>
+        <w:pStyle w:val="Compact"/>
+        <w:numPr>
+          <w:ilvl w:val="0"/>
+          <w:numId w:val="1002"/>
+        </w:numPr>
+      </w:pPr>
+      <w:r>
+        <w:rPr>
+          <w:b/>
+          <w:bCs/>
+        </w:rPr>
+        <w:t xml:space="preserve">Dynamic permission overrides</w:t>
+      </w:r>
+      <w:r>
+        <w:t xml:space="preserve"> </w:t>
+      </w:r>
+      <w:r>
+        <w:t xml:space="preserve">with temporary elevated access</w:t>
+      </w:r>
+    </w:p>
+    <w:p>
+      <w:pPr>
+        <w:pStyle w:val="Compact"/>
+        <w:numPr>
+          <w:ilvl w:val="0"/>
+          <w:numId w:val="1002"/>
+        </w:numPr>
+      </w:pPr>
+      <w:r>
+        <w:rPr>
+          <w:b/>
+          <w:bCs/>
+        </w:rPr>
+        <w:t xml:space="preserve">Wallet PIN</w:t>
+      </w:r>
+      <w:r>
+        <w:t xml:space="preserve"> </w:t>
+      </w:r>
+      <w:r>
+        <w:t xml:space="preserve">with 30-minute lockout after 5 failed attempts</w:t>
+      </w:r>
+    </w:p>
+    <w:p>
+      <w:pPr>
+        <w:pStyle w:val="Compact"/>
+        <w:numPr>
+          <w:ilvl w:val="0"/>
+          <w:numId w:val="1002"/>
+        </w:numPr>
+      </w:pPr>
+      <w:r>
+        <w:rPr>
+          <w:b/>
+          <w:bCs/>
+        </w:rPr>
+        <w:t xml:space="preserve">T&amp;C acceptance</w:t>
+      </w:r>
+      <w:r>
+        <w:t xml:space="preserve"> </w:t>
+      </w:r>
+      <w:r>
+        <w:t xml:space="preserve">required before bidding (with version tracking)</w:t>
+      </w:r>
+    </w:p>
+    <w:bookmarkEnd w:id="22"/>
+    <w:bookmarkStart w:id="23" w:name="payments-settlement"/>
+    <w:p>
+      <w:pPr>
+        <w:pStyle w:val="Heading3"/>
+      </w:pPr>
+      <w:r>
+        <w:rPr>
+          <w:rStyle w:val="SectionNumber"/>
+        </w:rPr>
+        <w:t xml:space="preserve">1.10.3</w:t>
+      </w:r>
+      <w:r>
+        <w:tab/>
+      </w:r>
+      <w:r>
+        <w:t xml:space="preserve">Payments &amp; Settlement</w:t>
+      </w:r>
+    </w:p>
+    <w:p>
+      <w:pPr>
+        <w:pStyle w:val="Compact"/>
+        <w:numPr>
+          <w:ilvl w:val="0"/>
+          <w:numId w:val="1003"/>
+        </w:numPr>
+      </w:pPr>
+      <w:r>
+        <w:rPr>
+          <w:b/>
+          <w:bCs/>
+        </w:rPr>
+        <w:t xml:space="preserve">SikinaPay</w:t>
+      </w:r>
+      <w:r>
+        <w:t xml:space="preserve"> </w:t>
+      </w:r>
+      <w:r>
+        <w:t xml:space="preserve">and</w:t>
+      </w:r>
+      <w:r>
+        <w:t xml:space="preserve"> </w:t>
+      </w:r>
+      <w:r>
+        <w:rPr>
+          <w:b/>
+          <w:bCs/>
+        </w:rPr>
+        <w:t xml:space="preserve">Awash Bank</w:t>
+      </w:r>
+      <w:r>
+        <w:t xml:space="preserve"> </w:t>
+      </w:r>
+      <w:r>
+        <w:t xml:space="preserve">payment gateway integration</w:t>
+      </w:r>
+    </w:p>
+    <w:p>
+      <w:pPr>
+        <w:pStyle w:val="Compact"/>
+        <w:numPr>
+          <w:ilvl w:val="0"/>
+          <w:numId w:val="1003"/>
+        </w:numPr>
+      </w:pPr>
+      <w:r>
+        <w:rPr>
+          <w:b/>
+          <w:bCs/>
+        </w:rPr>
+        <w:t xml:space="preserve">Internal wallet</w:t>
+      </w:r>
+      <w:r>
+        <w:t xml:space="preserve"> </w:t>
+      </w:r>
+      <w:r>
+        <w:t xml:space="preserve">payments with atomic fee deduction</w:t>
+      </w:r>
+    </w:p>
+    <w:p>
+      <w:pPr>
+        <w:pStyle w:val="Compact"/>
+        <w:numPr>
+          <w:ilvl w:val="0"/>
+          <w:numId w:val="1003"/>
+        </w:numPr>
+      </w:pPr>
+      <w:r>
+        <w:rPr>
+          <w:b/>
+          <w:bCs/>
+        </w:rPr>
+        <w:t xml:space="preserve">Payment reminder cron</w:t>
+      </w:r>
+      <w:r>
+        <w:t xml:space="preserve"> </w:t>
+      </w:r>
+      <w:r>
+        <w:t xml:space="preserve">(every 30 minutes) via SMS + push</w:t>
+      </w:r>
+    </w:p>
+    <w:p>
+      <w:pPr>
+        <w:pStyle w:val="Compact"/>
+        <w:numPr>
+          <w:ilvl w:val="0"/>
+          <w:numId w:val="1003"/>
+        </w:numPr>
+      </w:pPr>
+      <w:r>
+        <w:rPr>
+          <w:b/>
+          <w:bCs/>
+        </w:rPr>
+        <w:t xml:space="preserve">Settlement reports</w:t>
+      </w:r>
+      <w:r>
+        <w:t xml:space="preserve"> </w:t>
+      </w:r>
+      <w:r>
+        <w:t xml:space="preserve">with revenue, platform share, tax, commission</w:t>
+      </w:r>
+    </w:p>
+    <w:p>
+      <w:pPr>
+        <w:pStyle w:val="Compact"/>
+        <w:numPr>
+          <w:ilvl w:val="0"/>
+          <w:numId w:val="1003"/>
+        </w:numPr>
+      </w:pPr>
+      <w:r>
+        <w:rPr>
+          <w:b/>
+          <w:bCs/>
+        </w:rPr>
+        <w:t xml:space="preserve">Winner rotation</w:t>
+      </w:r>
+      <w:r>
+        <w:t xml:space="preserve"> </w:t>
+      </w:r>
+      <w:r>
+        <w:t xml:space="preserve">for unpaid winners (24h deadline)</w:t>
+      </w:r>
+    </w:p>
+    <w:bookmarkEnd w:id="23"/>
+    <w:bookmarkStart w:id="24" w:name="admin-analytics"/>
+    <w:p>
+      <w:pPr>
+        <w:pStyle w:val="Heading3"/>
+      </w:pPr>
+      <w:r>
+        <w:rPr>
+          <w:rStyle w:val="SectionNumber"/>
+        </w:rPr>
+        <w:t xml:space="preserve">1.10.4</w:t>
+      </w:r>
+      <w:r>
+        <w:tab/>
+      </w:r>
+      <w:r>
+        <w:t xml:space="preserve">Admin &amp; Analytics</w:t>
+      </w:r>
+    </w:p>
+    <w:p>
+      <w:pPr>
+        <w:pStyle w:val="Compact"/>
+        <w:numPr>
+          <w:ilvl w:val="0"/>
+          <w:numId w:val="1004"/>
+        </w:numPr>
+      </w:pPr>
+      <w:r>
+        <w:rPr>
+          <w:b/>
+          <w:bCs/>
+        </w:rPr>
+        <w:t xml:space="preserve">Advanced analytics dashboard</w:t>
+      </w:r>
+      <w:r>
+        <w:t xml:space="preserve"> </w:t>
+      </w:r>
+      <w:r>
+        <w:t xml:space="preserve">(revenue, user, auction, bid, payment analytics)</w:t>
+      </w:r>
+    </w:p>
+    <w:p>
+      <w:pPr>
+        <w:pStyle w:val="Compact"/>
+        <w:numPr>
+          <w:ilvl w:val="0"/>
+          <w:numId w:val="1004"/>
+        </w:numPr>
+      </w:pPr>
+      <w:r>
+        <w:rPr>
+          <w:b/>
+          <w:bCs/>
+        </w:rPr>
+        <w:t xml:space="preserve">Audit log viewer</w:t>
+      </w:r>
+      <w:r>
+        <w:t xml:space="preserve"> </w:t>
+      </w:r>
+      <w:r>
+        <w:t xml:space="preserve">with filtering, pagination, and CSV export</w:t>
+      </w:r>
+    </w:p>
+    <w:p>
+      <w:pPr>
+        <w:pStyle w:val="Compact"/>
+        <w:numPr>
+          <w:ilvl w:val="0"/>
+          <w:numId w:val="1004"/>
+        </w:numPr>
+      </w:pPr>
+      <w:r>
+        <w:rPr>
+          <w:b/>
+          <w:bCs/>
+        </w:rPr>
+        <w:t xml:space="preserve">Winner management</w:t>
+      </w:r>
+      <w:r>
+        <w:t xml:space="preserve"> </w:t>
+      </w:r>
+      <w:r>
+        <w:t xml:space="preserve">(extend deadline, confirm payment, trigger rotation)</w:t>
+      </w:r>
+    </w:p>
+    <w:p>
+      <w:pPr>
+        <w:pStyle w:val="Compact"/>
+        <w:numPr>
+          <w:ilvl w:val="0"/>
+          <w:numId w:val="1004"/>
+        </w:numPr>
+      </w:pPr>
+      <w:r>
+        <w:rPr>
+          <w:b/>
+          <w:bCs/>
+        </w:rPr>
+        <w:t xml:space="preserve">Product approval workflow</w:t>
+      </w:r>
+      <w:r>
+        <w:t xml:space="preserve"> </w:t>
+      </w:r>
+      <w:r>
+        <w:t xml:space="preserve">(PENDING → APPROVED → REJECTED)</w:t>
+      </w:r>
+    </w:p>
+    <w:p>
+      <w:pPr>
+        <w:pStyle w:val="Compact"/>
+        <w:numPr>
+          <w:ilvl w:val="0"/>
+          <w:numId w:val="1004"/>
+        </w:numPr>
+      </w:pPr>
+      <w:r>
+        <w:rPr>
+          <w:b/>
+          <w:bCs/>
+        </w:rPr>
+        <w:t xml:space="preserve">Dispute resolution</w:t>
+      </w:r>
+      <w:r>
+        <w:t xml:space="preserve"> </w:t>
+      </w:r>
+      <w:r>
+        <w:t xml:space="preserve">system with admin review</w:t>
+      </w:r>
+    </w:p>
+    <w:p>
+      <w:pPr>
+        <w:pStyle w:val="Compact"/>
+        <w:numPr>
+          <w:ilvl w:val="0"/>
+          <w:numId w:val="1004"/>
+        </w:numPr>
+      </w:pPr>
+      <w:r>
+        <w:rPr>
+          <w:b/>
+          <w:bCs/>
+        </w:rPr>
+        <w:t xml:space="preserve">CSV export</w:t>
+      </w:r>
+      <w:r>
+        <w:t xml:space="preserve"> </w:t>
+      </w:r>
+      <w:r>
+        <w:t xml:space="preserve">for users, transactions, auctions, products, settlements, audit logs</w:t>
+      </w:r>
+    </w:p>
+    <w:bookmarkEnd w:id="24"/>
+    <w:bookmarkStart w:id="25" w:name="performance-scalability"/>
+    <w:p>
+      <w:pPr>
+        <w:pStyle w:val="Heading3"/>
+      </w:pPr>
+      <w:r>
+        <w:rPr>
+          <w:rStyle w:val="SectionNumber"/>
+        </w:rPr>
+        <w:t xml:space="preserve">1.10.5</w:t>
+      </w:r>
+      <w:r>
+        <w:tab/>
+      </w:r>
+      <w:r>
+        <w:t xml:space="preserve">Performance &amp; Scalability</w:t>
+      </w:r>
+    </w:p>
+    <w:p>
+      <w:pPr>
+        <w:pStyle w:val="Compact"/>
+        <w:numPr>
+          <w:ilvl w:val="0"/>
+          <w:numId w:val="1005"/>
+        </w:numPr>
+      </w:pPr>
+      <w:r>
+        <w:rPr>
+          <w:b/>
+          <w:bCs/>
+        </w:rPr>
+        <w:t xml:space="preserve">Redis caching layer</w:t>
+      </w:r>
+      <w:r>
+        <w:t xml:space="preserve"> </w:t>
+      </w:r>
+      <w:r>
+        <w:t xml:space="preserve">for read-heavy endpoints (auction listings, products, stats)</w:t>
+      </w:r>
+    </w:p>
+    <w:p>
+      <w:pPr>
+        <w:pStyle w:val="Compact"/>
+        <w:numPr>
+          <w:ilvl w:val="0"/>
+          <w:numId w:val="1005"/>
+        </w:numPr>
+      </w:pPr>
+      <w:r>
+        <w:rPr>
+          <w:b/>
+          <w:bCs/>
+        </w:rPr>
+        <w:t xml:space="preserve">Socket.io Redis adapter</w:t>
+      </w:r>
+      <w:r>
+        <w:t xml:space="preserve"> </w:t>
+      </w:r>
+      <w:r>
+        <w:t xml:space="preserve">for WebSocket horizontal scaling</w:t>
+      </w:r>
+    </w:p>
+    <w:p>
+      <w:pPr>
+        <w:pStyle w:val="Compact"/>
+        <w:numPr>
+          <w:ilvl w:val="0"/>
+          <w:numId w:val="1005"/>
+        </w:numPr>
+      </w:pPr>
+      <w:r>
+        <w:rPr>
+          <w:b/>
+          <w:bCs/>
+        </w:rPr>
+        <w:t xml:space="preserve">Redis Sentinel/Cluster</w:t>
+      </w:r>
+      <w:r>
+        <w:t xml:space="preserve"> </w:t>
+      </w:r>
+      <w:r>
+        <w:t xml:space="preserve">support for high availability</w:t>
+      </w:r>
+    </w:p>
+    <w:p>
+      <w:pPr>
+        <w:pStyle w:val="Compact"/>
+        <w:numPr>
+          <w:ilvl w:val="0"/>
+          <w:numId w:val="1005"/>
+        </w:numPr>
+      </w:pPr>
+      <w:r>
+        <w:rPr>
+          <w:b/>
+          <w:bCs/>
+        </w:rPr>
+        <w:t xml:space="preserve">Citus distributed PostgreSQL</w:t>
+      </w:r>
+      <w:r>
+        <w:t xml:space="preserve"> </w:t>
+      </w:r>
+      <w:r>
+        <w:t xml:space="preserve">for horizontal database scaling</w:t>
+      </w:r>
+    </w:p>
+    <w:p>
+      <w:pPr>
+        <w:pStyle w:val="Compact"/>
+        <w:numPr>
+          <w:ilvl w:val="0"/>
+          <w:numId w:val="1005"/>
+        </w:numPr>
+      </w:pPr>
+      <w:r>
+        <w:rPr>
+          <w:b/>
+          <w:bCs/>
+        </w:rPr>
+        <w:t xml:space="preserve">Kubernetes HPA</w:t>
+      </w:r>
+      <w:r>
+        <w:t xml:space="preserve"> </w:t>
+      </w:r>
+      <w:r>
+        <w:t xml:space="preserve">for auto-scaling backend services</w:t>
+      </w:r>
+    </w:p>
+    <w:bookmarkEnd w:id="25"/>
+    <w:bookmarkStart w:id="26" w:name="security-compliance"/>
+    <w:p>
+      <w:pPr>
+        <w:pStyle w:val="Heading3"/>
+      </w:pPr>
+      <w:r>
+        <w:rPr>
+          <w:rStyle w:val="SectionNumber"/>
+        </w:rPr>
+        <w:t xml:space="preserve">1.10.6</w:t>
+      </w:r>
+      <w:r>
+        <w:tab/>
+      </w:r>
+      <w:r>
+        <w:t xml:space="preserve">Security &amp; Compliance</w:t>
+      </w:r>
+    </w:p>
+    <w:p>
+      <w:pPr>
+        <w:pStyle w:val="Compact"/>
+        <w:numPr>
+          <w:ilvl w:val="0"/>
+          <w:numId w:val="1006"/>
+        </w:numPr>
+      </w:pPr>
+      <w:r>
+        <w:rPr>
+          <w:b/>
+          <w:bCs/>
+        </w:rPr>
+        <w:t xml:space="preserve">Immutable audit logs</w:t>
+      </w:r>
+      <w:r>
+        <w:t xml:space="preserve"> </w:t>
+      </w:r>
+      <w:r>
+        <w:t xml:space="preserve">for all admin actions, bidding events, payments, and access decisions</w:t>
+      </w:r>
+    </w:p>
+    <w:p>
+      <w:pPr>
+        <w:pStyle w:val="Compact"/>
+        <w:numPr>
+          <w:ilvl w:val="0"/>
+          <w:numId w:val="1006"/>
+        </w:numPr>
+      </w:pPr>
+      <w:r>
+        <w:rPr>
+          <w:b/>
+          <w:bCs/>
+        </w:rPr>
+        <w:t xml:space="preserve">HMAC-SHA256</w:t>
+      </w:r>
+      <w:r>
+        <w:t xml:space="preserve"> </w:t>
+      </w:r>
+      <w:r>
+        <w:t xml:space="preserve">webhook signature verification with timing-safe comparison</w:t>
+      </w:r>
+    </w:p>
+    <w:p>
+      <w:pPr>
+        <w:pStyle w:val="Compact"/>
+        <w:numPr>
+          <w:ilvl w:val="0"/>
+          <w:numId w:val="1006"/>
+        </w:numPr>
+      </w:pPr>
+      <w:r>
+        <w:rPr>
+          <w:b/>
+          <w:bCs/>
+        </w:rPr>
+        <w:t xml:space="preserve">Nonce validation</w:t>
+      </w:r>
+      <w:r>
+        <w:t xml:space="preserve"> </w:t>
+      </w:r>
+      <w:r>
+        <w:t xml:space="preserve">for replay attack prevention</w:t>
+      </w:r>
+    </w:p>
+    <w:p>
+      <w:pPr>
+        <w:pStyle w:val="Compact"/>
+        <w:numPr>
+          <w:ilvl w:val="0"/>
+          <w:numId w:val="1006"/>
+        </w:numPr>
+      </w:pPr>
+      <w:r>
+        <w:rPr>
+          <w:b/>
+          <w:bCs/>
+        </w:rPr>
+        <w:t xml:space="preserve">Rate limiting</w:t>
+      </w:r>
+      <w:r>
+        <w:t xml:space="preserve"> </w:t>
+      </w:r>
+      <w:r>
+        <w:t xml:space="preserve">on login (5/min), bidding (10/s), OTP (3/min)</w:t>
+      </w:r>
+    </w:p>
+    <w:p>
+      <w:pPr>
+        <w:pStyle w:val="Compact"/>
+        <w:numPr>
+          <w:ilvl w:val="0"/>
+          <w:numId w:val="1006"/>
+        </w:numPr>
+      </w:pPr>
+      <w:r>
+        <w:rPr>
+          <w:b/>
+          <w:bCs/>
+        </w:rPr>
+        <w:t xml:space="preserve">Backup &amp; disaster recovery</w:t>
+      </w:r>
+      <w:r>
+        <w:t xml:space="preserve"> </w:t>
+      </w:r>
+      <w:r>
+        <w:t xml:space="preserve">with pgBackRest and WAL-G</w:t>
+      </w:r>
+    </w:p>
+    <w:p>
+      <w:pPr>
+        <w:pStyle w:val="Compact"/>
+        <w:numPr>
+          <w:ilvl w:val="0"/>
+          <w:numId w:val="1006"/>
+        </w:numPr>
+      </w:pPr>
+      <w:r>
+        <w:rPr>
+          <w:b/>
+          <w:bCs/>
+        </w:rPr>
+        <w:t xml:space="preserve">RTO &lt; 4 hours, RPO &lt; 24 hours</w:t>
+      </w:r>
+      <w:r>
+        <w:t xml:space="preserve"> </w:t>
+      </w:r>
+      <w:r>
+        <w:t xml:space="preserve">with point-in-time recovery</w:t>
+      </w:r>
+    </w:p>
+    <w:bookmarkEnd w:id="26"/>
+    <w:bookmarkStart w:id="27" w:name="notifications"/>
+    <w:p>
+      <w:pPr>
+        <w:pStyle w:val="Heading3"/>
+      </w:pPr>
+      <w:r>
+        <w:rPr>
+          <w:rStyle w:val="SectionNumber"/>
+        </w:rPr>
+        <w:t xml:space="preserve">1.10.7</w:t>
+      </w:r>
+      <w:r>
+        <w:tab/>
+      </w:r>
+      <w:r>
+        <w:t xml:space="preserve">Notifications</w:t>
+      </w:r>
+    </w:p>
+    <w:p>
+      <w:pPr>
+        <w:pStyle w:val="Compact"/>
+        <w:numPr>
+          <w:ilvl w:val="0"/>
+          <w:numId w:val="1007"/>
+        </w:numPr>
+      </w:pPr>
+      <w:r>
+        <w:rPr>
+          <w:b/>
+          <w:bCs/>
+        </w:rPr>
+        <w:t xml:space="preserve">Push notifications</w:t>
+      </w:r>
+      <w:r>
+        <w:t xml:space="preserve"> </w:t>
+      </w:r>
+      <w:r>
+        <w:t xml:space="preserve">via Expo Push Service</w:t>
+      </w:r>
+    </w:p>
+    <w:p>
+      <w:pPr>
+        <w:pStyle w:val="Compact"/>
+        <w:numPr>
+          <w:ilvl w:val="0"/>
+          <w:numId w:val="1007"/>
+        </w:numPr>
+      </w:pPr>
+      <w:r>
+        <w:rPr>
+          <w:b/>
+          <w:bCs/>
+        </w:rPr>
+        <w:t xml:space="preserve">SMS notifications</w:t>
+      </w:r>
+      <w:r>
+        <w:t xml:space="preserve"> </w:t>
+      </w:r>
+      <w:r>
+        <w:t xml:space="preserve">via SMS Ethiopia</w:t>
+      </w:r>
+    </w:p>
+    <w:p>
+      <w:pPr>
+        <w:pStyle w:val="Compact"/>
+        <w:numPr>
+          <w:ilvl w:val="0"/>
+          <w:numId w:val="1007"/>
+        </w:numPr>
+      </w:pPr>
+      <w:r>
+        <w:rPr>
+          <w:b/>
+          <w:bCs/>
+        </w:rPr>
+        <w:t xml:space="preserve">In-app notifications</w:t>
+      </w:r>
+      <w:r>
+        <w:t xml:space="preserve"> </w:t>
+      </w:r>
+      <w:r>
+        <w:t xml:space="preserve">with bulk mark-read</w:t>
+      </w:r>
+    </w:p>
+    <w:p>
+      <w:pPr>
+        <w:pStyle w:val="Compact"/>
+        <w:numPr>
+          <w:ilvl w:val="0"/>
+          <w:numId w:val="1007"/>
+        </w:numPr>
+      </w:pPr>
+      <w:r>
+        <w:rPr>
+          <w:b/>
+          <w:bCs/>
+        </w:rPr>
+        <w:t xml:space="preserve">Payment reminders</w:t>
+      </w:r>
+      <w:r>
+        <w:t xml:space="preserve"> </w:t>
+      </w:r>
+      <w:r>
+        <w:t xml:space="preserve">via SMS + push (6h and 1h before deadline)</w:t>
+      </w:r>
+    </w:p>
+    <w:p>
+      <w:pPr>
+        <w:pStyle w:val="Compact"/>
+        <w:numPr>
+          <w:ilvl w:val="0"/>
+          <w:numId w:val="1007"/>
+        </w:numPr>
+      </w:pPr>
+      <w:r>
+        <w:rPr>
+          <w:b/>
+          <w:bCs/>
+        </w:rPr>
+        <w:t xml:space="preserve">Auction ending soon</w:t>
+      </w:r>
+      <w:r>
+        <w:t xml:space="preserve"> </w:t>
+      </w:r>
+      <w:r>
+        <w:t xml:space="preserve">alerts (5 minutes before)</w:t>
+      </w:r>
+    </w:p>
+    <w:bookmarkEnd w:id="27"/>
+    <w:bookmarkEnd w:id="28"/>
+    <w:bookmarkStart w:id="29" w:name="documentation"/>
+    <w:p>
+      <w:pPr>
+        <w:pStyle w:val="Heading2"/>
+      </w:pPr>
+      <w:r>
+        <w:rPr>
+          <w:rStyle w:val="SectionNumber"/>
+        </w:rPr>
+        <w:t xml:space="preserve">1.11</w:t>
+      </w:r>
+      <w:r>
+        <w:tab/>
+      </w:r>
+      <w:r>
+        <w:t xml:space="preserve">Documentation</w:t>
+      </w:r>
+    </w:p>
+    <w:p>
+      <w:pPr>
+        <w:pStyle w:val="FirstParagraph"/>
+      </w:pPr>
+      <w:r>
+        <w:t xml:space="preserve">Enterprise-grade documentation in</w:t>
       </w:r>
       <w:r>
         <w:t xml:space="preserve"> </w:t>
@@ -848,13 +4070,297 @@
         <w:rPr>
           <w:rStyle w:val="VerbatimChar"/>
         </w:rPr>
-        <w:t xml:space="preserve">0911111111</w:t>
-      </w:r>
-      <w:r>
-        <w:t xml:space="preserve"> </w:t>
-      </w:r>
-      <w:r>
-        <w:t xml:space="preserve">/</w:t>
+        <w:t xml:space="preserve">docs/</w:t>
+      </w:r>
+      <w:r>
+        <w:t xml:space="preserve">:</w:t>
+      </w:r>
+    </w:p>
+    <w:tbl>
+      <w:tblPr>
+        <w:tblStyle w:val="Table"/>
+        <w:tblW w:type="pct" w:w="5000"/>
+        <w:tblLayout w:type="fixed"/>
+        <w:tblLook w:firstRow="1" w:lastRow="0" w:firstColumn="0" w:lastColumn="0" w:noHBand="0" w:noVBand="0" w:val="0020"/>
+      </w:tblPr>
+      <w:tblGrid>
+        <w:gridCol w:w="2475"/>
+        <w:gridCol w:w="2227"/>
+        <w:gridCol w:w="3217"/>
+      </w:tblGrid>
+      <w:tr>
+        <w:trPr>
+          <w:tblHeader w:val="on"/>
+        </w:trPr>
+        <w:tc>
+          <w:tcPr/>
+          <w:p>
+            <w:pPr>
+              <w:pStyle w:val="Compact"/>
+            </w:pPr>
+            <w:r>
+              <w:t xml:space="preserve">Document</w:t>
+            </w:r>
+          </w:p>
+        </w:tc>
+        <w:tc>
+          <w:tcPr/>
+          <w:p>
+            <w:pPr>
+              <w:pStyle w:val="Compact"/>
+            </w:pPr>
+            <w:r>
+              <w:t xml:space="preserve">Version</w:t>
+            </w:r>
+          </w:p>
+        </w:tc>
+        <w:tc>
+          <w:tcPr/>
+          <w:p>
+            <w:pPr>
+              <w:pStyle w:val="Compact"/>
+            </w:pPr>
+            <w:r>
+              <w:t xml:space="preserve">Description</w:t>
+            </w:r>
+          </w:p>
+        </w:tc>
+      </w:tr>
+      <w:tr>
+        <w:tc>
+          <w:tcPr/>
+          <w:p>
+            <w:pPr>
+              <w:pStyle w:val="Compact"/>
+            </w:pPr>
+            <w:r>
+              <w:rPr>
+                <w:rStyle w:val="VerbatimChar"/>
+              </w:rPr>
+              <w:t xml:space="preserve">SRS.md</w:t>
+            </w:r>
+          </w:p>
+        </w:tc>
+        <w:tc>
+          <w:tcPr/>
+          <w:p>
+            <w:pPr>
+              <w:pStyle w:val="Compact"/>
+            </w:pPr>
+            <w:r>
+              <w:t xml:space="preserve">v6.0</w:t>
+            </w:r>
+          </w:p>
+        </w:tc>
+        <w:tc>
+          <w:tcPr/>
+          <w:p>
+            <w:pPr>
+              <w:pStyle w:val="Compact"/>
+            </w:pPr>
+            <w:r>
+              <w:t xml:space="preserve">Software Requirements Specification (IEEE-830 compliant)</w:t>
+            </w:r>
+          </w:p>
+        </w:tc>
+      </w:tr>
+      <w:tr>
+        <w:tc>
+          <w:tcPr/>
+          <w:p>
+            <w:pPr>
+              <w:pStyle w:val="Compact"/>
+            </w:pPr>
+            <w:r>
+              <w:rPr>
+                <w:rStyle w:val="VerbatimChar"/>
+              </w:rPr>
+              <w:t xml:space="preserve">SDD.md</w:t>
+            </w:r>
+          </w:p>
+        </w:tc>
+        <w:tc>
+          <w:tcPr/>
+          <w:p>
+            <w:pPr>
+              <w:pStyle w:val="Compact"/>
+            </w:pPr>
+            <w:r>
+              <w:t xml:space="preserve">v3.0</w:t>
+            </w:r>
+          </w:p>
+        </w:tc>
+        <w:tc>
+          <w:tcPr/>
+          <w:p>
+            <w:pPr>
+              <w:pStyle w:val="Compact"/>
+            </w:pPr>
+            <w:r>
+              <w:t xml:space="preserve">System Design Document (architecture, ADRs, capacity planning)</w:t>
+            </w:r>
+          </w:p>
+        </w:tc>
+      </w:tr>
+      <w:tr>
+        <w:tc>
+          <w:tcPr/>
+          <w:p>
+            <w:pPr>
+              <w:pStyle w:val="Compact"/>
+            </w:pPr>
+            <w:r>
+              <w:rPr>
+                <w:rStyle w:val="VerbatimChar"/>
+              </w:rPr>
+              <w:t xml:space="preserve">TTD_LLD.md</w:t>
+            </w:r>
+          </w:p>
+        </w:tc>
+        <w:tc>
+          <w:tcPr/>
+          <w:p>
+            <w:pPr>
+              <w:pStyle w:val="Compact"/>
+            </w:pPr>
+            <w:r>
+              <w:t xml:space="preserve">v3.0</w:t>
+            </w:r>
+          </w:p>
+        </w:tc>
+        <w:tc>
+          <w:tcPr/>
+          <w:p>
+            <w:pPr>
+              <w:pStyle w:val="Compact"/>
+            </w:pPr>
+            <w:r>
+              <w:t xml:space="preserve">Technical Specifications &amp; Low-Level Design</w:t>
+            </w:r>
+          </w:p>
+        </w:tc>
+      </w:tr>
+      <w:tr>
+        <w:tc>
+          <w:tcPr/>
+          <w:p>
+            <w:pPr>
+              <w:pStyle w:val="Compact"/>
+            </w:pPr>
+            <w:r>
+              <w:rPr>
+                <w:rStyle w:val="VerbatimChar"/>
+              </w:rPr>
+              <w:t xml:space="preserve">UserGuide.md</w:t>
+            </w:r>
+          </w:p>
+        </w:tc>
+        <w:tc>
+          <w:tcPr/>
+          <w:p>
+            <w:pPr>
+              <w:pStyle w:val="Compact"/>
+            </w:pPr>
+            <w:r>
+              <w:t xml:space="preserve">v3.0</w:t>
+            </w:r>
+          </w:p>
+        </w:tc>
+        <w:tc>
+          <w:tcPr/>
+          <w:p>
+            <w:pPr>
+              <w:pStyle w:val="Compact"/>
+            </w:pPr>
+            <w:r>
+              <w:t xml:space="preserve">User Guide (user rights, dispute resolution, fair play)</w:t>
+            </w:r>
+          </w:p>
+        </w:tc>
+      </w:tr>
+      <w:tr>
+        <w:tc>
+          <w:tcPr/>
+          <w:p>
+            <w:pPr>
+              <w:pStyle w:val="Compact"/>
+            </w:pPr>
+            <w:r>
+              <w:rPr>
+                <w:rStyle w:val="VerbatimChar"/>
+              </w:rPr>
+              <w:t xml:space="preserve">REDIS_HA.md</w:t>
+            </w:r>
+          </w:p>
+        </w:tc>
+        <w:tc>
+          <w:tcPr/>
+          <w:p>
+            <w:pPr>
+              <w:pStyle w:val="Compact"/>
+            </w:pPr>
+            <w:r>
+              <w:t xml:space="preserve">v1.0</w:t>
+            </w:r>
+          </w:p>
+        </w:tc>
+        <w:tc>
+          <w:tcPr/>
+          <w:p>
+            <w:pPr>
+              <w:pStyle w:val="Compact"/>
+            </w:pPr>
+            <w:r>
+              <w:t xml:space="preserve">Redis High Availability Configuration</w:t>
+            </w:r>
+          </w:p>
+        </w:tc>
+      </w:tr>
+      <w:tr>
+        <w:tc>
+          <w:tcPr/>
+          <w:p>
+            <w:pPr>
+              <w:pStyle w:val="Compact"/>
+            </w:pPr>
+            <w:r>
+              <w:rPr>
+                <w:rStyle w:val="VerbatimChar"/>
+              </w:rPr>
+              <w:t xml:space="preserve">PRISMA_BETTER_AUTH_MIGRATION.md</w:t>
+            </w:r>
+          </w:p>
+        </w:tc>
+        <w:tc>
+          <w:tcPr/>
+          <w:p>
+            <w:pPr>
+              <w:pStyle w:val="Compact"/>
+            </w:pPr>
+            <w:r>
+              <w:t xml:space="preserve">v1.0</w:t>
+            </w:r>
+          </w:p>
+        </w:tc>
+        <w:tc>
+          <w:tcPr/>
+          <w:p>
+            <w:pPr>
+              <w:pStyle w:val="Compact"/>
+            </w:pPr>
+            <w:r>
+              <w:t xml:space="preserve">Prisma + Better-auth Migration Guide</w:t>
+            </w:r>
+          </w:p>
+        </w:tc>
+      </w:tr>
+    </w:tbl>
+    <w:p>
+      <w:pPr>
+        <w:pStyle w:val="BodyText"/>
+      </w:pPr>
+      <w:r>
+        <w:t xml:space="preserve">Generated DOCX and HTML versions in</w:t>
       </w:r>
       <w:r>
         <w:t xml:space="preserve"> </w:t>
@@ -863,10 +4369,231 @@
         <w:rPr>
           <w:rStyle w:val="VerbatimChar"/>
         </w:rPr>
-        <w:t xml:space="preserve">0912222222</w:t>
-      </w:r>
-      <w:r>
-        <w:t xml:space="preserve">, password</w:t>
+        <w:t xml:space="preserve">docs/output/</w:t>
+      </w:r>
+      <w:r>
+        <w:t xml:space="preserve">.</w:t>
+      </w:r>
+    </w:p>
+    <w:bookmarkEnd w:id="29"/>
+    <w:bookmarkStart w:id="30" w:name="backup-disaster-recovery"/>
+    <w:p>
+      <w:pPr>
+        <w:pStyle w:val="Heading2"/>
+      </w:pPr>
+      <w:r>
+        <w:rPr>
+          <w:rStyle w:val="SectionNumber"/>
+        </w:rPr>
+        <w:t xml:space="preserve">1.12</w:t>
+      </w:r>
+      <w:r>
+        <w:tab/>
+      </w:r>
+      <w:r>
+        <w:t xml:space="preserve">Backup &amp; Disaster Recovery</w:t>
+      </w:r>
+    </w:p>
+    <w:p>
+      <w:pPr>
+        <w:pStyle w:val="SourceCode"/>
+      </w:pPr>
+      <w:r>
+        <w:rPr>
+          <w:rStyle w:val="CommentTok"/>
+        </w:rPr>
+        <w:t xml:space="preserve"># pgBackRest backups</w:t>
+      </w:r>
+      <w:r>
+        <w:br/>
+      </w:r>
+      <w:r>
+        <w:rPr>
+          <w:rStyle w:val="FunctionTok"/>
+        </w:rPr>
+        <w:t xml:space="preserve">bash</w:t>
+      </w:r>
+      <w:r>
+        <w:rPr>
+          <w:rStyle w:val="NormalTok"/>
+        </w:rPr>
+        <w:t xml:space="preserve"> scripts/backup-pgbackrest.sh full      </w:t>
+      </w:r>
+      <w:r>
+        <w:rPr>
+          <w:rStyle w:val="CommentTok"/>
+        </w:rPr>
+        <w:t xml:space="preserve"># Full backup</w:t>
+      </w:r>
+      <w:r>
+        <w:br/>
+      </w:r>
+      <w:r>
+        <w:rPr>
+          <w:rStyle w:val="FunctionTok"/>
+        </w:rPr>
+        <w:t xml:space="preserve">bash</w:t>
+      </w:r>
+      <w:r>
+        <w:rPr>
+          <w:rStyle w:val="NormalTok"/>
+        </w:rPr>
+        <w:t xml:space="preserve"> scripts/backup-pgbackrest.sh diff      </w:t>
+      </w:r>
+      <w:r>
+        <w:rPr>
+          <w:rStyle w:val="CommentTok"/>
+        </w:rPr>
+        <w:t xml:space="preserve"># Differential backup</w:t>
+      </w:r>
+      <w:r>
+        <w:br/>
+      </w:r>
+      <w:r>
+        <w:rPr>
+          <w:rStyle w:val="FunctionTok"/>
+        </w:rPr>
+        <w:t xml:space="preserve">bash</w:t>
+      </w:r>
+      <w:r>
+        <w:rPr>
+          <w:rStyle w:val="NormalTok"/>
+        </w:rPr>
+        <w:t xml:space="preserve"> scripts/backup-pgbackrest.sh verify    </w:t>
+      </w:r>
+      <w:r>
+        <w:rPr>
+          <w:rStyle w:val="CommentTok"/>
+        </w:rPr>
+        <w:t xml:space="preserve"># Verify backup</w:t>
+      </w:r>
+      <w:r>
+        <w:br/>
+      </w:r>
+      <w:r>
+        <w:br/>
+      </w:r>
+      <w:r>
+        <w:rPr>
+          <w:rStyle w:val="CommentTok"/>
+        </w:rPr>
+        <w:t xml:space="preserve"># WAL-G cloud backups</w:t>
+      </w:r>
+      <w:r>
+        <w:br/>
+      </w:r>
+      <w:r>
+        <w:rPr>
+          <w:rStyle w:val="FunctionTok"/>
+        </w:rPr>
+        <w:t xml:space="preserve">bash</w:t>
+      </w:r>
+      <w:r>
+        <w:rPr>
+          <w:rStyle w:val="NormalTok"/>
+        </w:rPr>
+        <w:t xml:space="preserve"> scripts/backup-walg.sh push            </w:t>
+      </w:r>
+      <w:r>
+        <w:rPr>
+          <w:rStyle w:val="CommentTok"/>
+        </w:rPr>
+        <w:t xml:space="preserve"># Push base backup to S3</w:t>
+      </w:r>
+      <w:r>
+        <w:br/>
+      </w:r>
+      <w:r>
+        <w:rPr>
+          <w:rStyle w:val="FunctionTok"/>
+        </w:rPr>
+        <w:t xml:space="preserve">bash</w:t>
+      </w:r>
+      <w:r>
+        <w:rPr>
+          <w:rStyle w:val="NormalTok"/>
+        </w:rPr>
+        <w:t xml:space="preserve"> scripts/backup-walg.sh list            </w:t>
+      </w:r>
+      <w:r>
+        <w:rPr>
+          <w:rStyle w:val="CommentTok"/>
+        </w:rPr>
+        <w:t xml:space="preserve"># List available backups</w:t>
+      </w:r>
+      <w:r>
+        <w:br/>
+      </w:r>
+      <w:r>
+        <w:br/>
+      </w:r>
+      <w:r>
+        <w:rPr>
+          <w:rStyle w:val="CommentTok"/>
+        </w:rPr>
+        <w:t xml:space="preserve"># Disaster recovery restore</w:t>
+      </w:r>
+      <w:r>
+        <w:br/>
+      </w:r>
+      <w:r>
+        <w:rPr>
+          <w:rStyle w:val="FunctionTok"/>
+        </w:rPr>
+        <w:t xml:space="preserve">bash</w:t>
+      </w:r>
+      <w:r>
+        <w:rPr>
+          <w:rStyle w:val="NormalTok"/>
+        </w:rPr>
+        <w:t xml:space="preserve"> scripts/restore-disaster-recovery.sh restore    </w:t>
+      </w:r>
+      <w:r>
+        <w:rPr>
+          <w:rStyle w:val="CommentTok"/>
+        </w:rPr>
+        <w:t xml:space="preserve"># Full restore</w:t>
+      </w:r>
+      <w:r>
+        <w:br/>
+      </w:r>
+      <w:r>
+        <w:rPr>
+          <w:rStyle w:val="FunctionTok"/>
+        </w:rPr>
+        <w:t xml:space="preserve">bash</w:t>
+      </w:r>
+      <w:r>
+        <w:rPr>
+          <w:rStyle w:val="NormalTok"/>
+        </w:rPr>
+        <w:t xml:space="preserve"> scripts/restore-disaster-recovery.sh pitr </w:t>
+      </w:r>
+      <w:r>
+        <w:rPr>
+          <w:rStyle w:val="StringTok"/>
+        </w:rPr>
+        <w:t xml:space="preserve">'2026-08-18 10:00:00'</w:t>
+      </w:r>
+      <w:r>
+        <w:rPr>
+          <w:rStyle w:val="NormalTok"/>
+        </w:rPr>
+        <w:t xml:space="preserve">  </w:t>
+      </w:r>
+      <w:r>
+        <w:rPr>
+          <w:rStyle w:val="CommentTok"/>
+        </w:rPr>
+        <w:t xml:space="preserve"># Point-in-time recovery</w:t>
+      </w:r>
+    </w:p>
+    <w:p>
+      <w:pPr>
+        <w:pStyle w:val="FirstParagraph"/>
+      </w:pPr>
+      <w:r>
+        <w:t xml:space="preserve">Kubernetes backup CronJobs in</w:t>
       </w:r>
       <w:r>
         <w:t xml:space="preserve"> </w:t>
@@ -875,26 +4602,35 @@
         <w:rPr>
           <w:rStyle w:val="VerbatimChar"/>
         </w:rPr>
-        <w:t xml:space="preserve">1234</w:t>
-      </w:r>
-    </w:p>
-    <w:bookmarkEnd w:id="12"/>
-    <w:bookmarkStart w:id="13" w:name="environment"/>
-    <w:p>
-      <w:pPr>
-        <w:pStyle w:val="Heading2"/>
-      </w:pPr>
-      <w:r>
-        <w:rPr>
-          <w:rStyle w:val="SectionNumber"/>
-        </w:rPr>
-        <w:t xml:space="preserve">1.5</w:t>
-      </w:r>
-      <w:r>
-        <w:tab/>
-      </w:r>
-      <w:r>
-        <w:t xml:space="preserve">Environment</w:t>
+        <w:t xml:space="preserve">k8s/backup-cronjob.yaml</w:t>
+      </w:r>
+      <w:r>
+        <w:t xml:space="preserve">:</w:t>
+      </w:r>
+      <w:r>
+        <w:t xml:space="preserve"> </w:t>
+      </w:r>
+      <w:r>
+        <w:t xml:space="preserve">- Daily full backup at 02:00 UTC</w:t>
+      </w:r>
+      <w:r>
+        <w:t xml:space="preserve"> </w:t>
+      </w:r>
+      <w:r>
+        <w:t xml:space="preserve">- Differential backup every 6 hours</w:t>
+      </w:r>
+      <w:r>
+        <w:t xml:space="preserve"> </w:t>
+      </w:r>
+      <w:r>
+        <w:t xml:space="preserve">- WAL-G alternative for cloud storage</w:t>
+      </w:r>
+    </w:p>
+    <w:p>
+      <w:r>
+        <w:pict>
+          <v:rect style="width:0;height:1.5pt" o:hralign="center" o:hrstd="t" o:hr="t"/>
+        </w:pict>
       </w:r>
     </w:p>
     <w:p>
@@ -902,7 +4638,7 @@
         <w:pStyle w:val="FirstParagraph"/>
       </w:pPr>
       <w:r>
-        <w:t xml:space="preserve">Each service has a</w:t>
+        <w:t xml:space="preserve">See</w:t>
       </w:r>
       <w:r>
         <w:t xml:space="preserve"> </w:t>
@@ -911,10 +4647,13 @@
         <w:rPr>
           <w:rStyle w:val="VerbatimChar"/>
         </w:rPr>
-        <w:t xml:space="preserve">.env.example</w:t>
-      </w:r>
-      <w:r>
-        <w:t xml:space="preserve">. Copy to</w:t>
+        <w:t xml:space="preserve">docs/SRS.md</w:t>
+      </w:r>
+      <w:r>
+        <w:t xml:space="preserve"> </w:t>
+      </w:r>
+      <w:r>
+        <w:t xml:space="preserve">for the full requirements specification,</w:t>
       </w:r>
       <w:r>
         <w:t xml:space="preserve"> </w:t>
@@ -923,19 +4662,13 @@
         <w:rPr>
           <w:rStyle w:val="VerbatimChar"/>
         </w:rPr>
-        <w:t xml:space="preserve">.env</w:t>
-      </w:r>
-      <w:r>
-        <w:t xml:space="preserve"> </w:t>
-      </w:r>
-      <w:r>
-        <w:t xml:space="preserve">and fill in. Critical vars:</w:t>
-      </w:r>
-      <w:r>
-        <w:t xml:space="preserve"> </w:t>
-      </w:r>
-      <w:r>
-        <w:t xml:space="preserve">-</w:t>
+        <w:t xml:space="preserve">docs/SDD.md</w:t>
+      </w:r>
+      <w:r>
+        <w:t xml:space="preserve"> </w:t>
+      </w:r>
+      <w:r>
+        <w:t xml:space="preserve">for the system design,</w:t>
       </w:r>
       <w:r>
         <w:t xml:space="preserve"> </w:t>
@@ -944,10 +4677,13 @@
         <w:rPr>
           <w:rStyle w:val="VerbatimChar"/>
         </w:rPr>
-        <w:t xml:space="preserve">JWT_SECRET</w:t>
-      </w:r>
-      <w:r>
-        <w:t xml:space="preserve">,</w:t>
+        <w:t xml:space="preserve">SECURITY.md</w:t>
+      </w:r>
+      <w:r>
+        <w:t xml:space="preserve"> </w:t>
+      </w:r>
+      <w:r>
+        <w:t xml:space="preserve">for the security model, and</w:t>
       </w:r>
       <w:r>
         <w:t xml:space="preserve"> </w:t>
@@ -956,476 +4692,6 @@
         <w:rPr>
           <w:rStyle w:val="VerbatimChar"/>
         </w:rPr>
-        <w:t xml:space="preserve">JWT_REFRESH_SECRET</w:t>
-      </w:r>
-      <w:r>
-        <w:t xml:space="preserve"> </w:t>
-      </w:r>
-      <w:r>
-        <w:t xml:space="preserve">(must NOT be</w:t>
-      </w:r>
-      <w:r>
-        <w:t xml:space="preserve"> </w:t>
-      </w:r>
-      <w:r>
-        <w:rPr>
-          <w:rStyle w:val="VerbatimChar"/>
-        </w:rPr>
-        <w:t xml:space="preserve">takelow-jwt-secret</w:t>
-      </w:r>
-      <w:r>
-        <w:t xml:space="preserve"> </w:t>
-      </w:r>
-      <w:r>
-        <w:t xml:space="preserve">— app refuses to start)</w:t>
-      </w:r>
-      <w:r>
-        <w:t xml:space="preserve"> </w:t>
-      </w:r>
-      <w:r>
-        <w:t xml:space="preserve">-</w:t>
-      </w:r>
-      <w:r>
-        <w:t xml:space="preserve"> </w:t>
-      </w:r>
-      <w:r>
-        <w:rPr>
-          <w:rStyle w:val="VerbatimChar"/>
-        </w:rPr>
-        <w:t xml:space="preserve">INTERNAL_API_KEY</w:t>
-      </w:r>
-      <w:r>
-        <w:t xml:space="preserve"> </w:t>
-      </w:r>
-      <w:r>
-        <w:t xml:space="preserve">(service-to-service auth)</w:t>
-      </w:r>
-      <w:r>
-        <w:t xml:space="preserve"> </w:t>
-      </w:r>
-      <w:r>
-        <w:t xml:space="preserve">-</w:t>
-      </w:r>
-      <w:r>
-        <w:t xml:space="preserve"> </w:t>
-      </w:r>
-      <w:r>
-        <w:rPr>
-          <w:rStyle w:val="VerbatimChar"/>
-        </w:rPr>
-        <w:t xml:space="preserve">DATABASE_URL</w:t>
-      </w:r>
-      <w:r>
-        <w:t xml:space="preserve">,</w:t>
-      </w:r>
-      <w:r>
-        <w:t xml:space="preserve"> </w:t>
-      </w:r>
-      <w:r>
-        <w:rPr>
-          <w:rStyle w:val="VerbatimChar"/>
-        </w:rPr>
-        <w:t xml:space="preserve">REDIS_URL</w:t>
-      </w:r>
-      <w:r>
-        <w:t xml:space="preserve"> </w:t>
-      </w:r>
-      <w:r>
-        <w:t xml:space="preserve">-</w:t>
-      </w:r>
-      <w:r>
-        <w:t xml:space="preserve"> </w:t>
-      </w:r>
-      <w:r>
-        <w:rPr>
-          <w:rStyle w:val="VerbatimChar"/>
-        </w:rPr>
-        <w:t xml:space="preserve">CORS_ORIGINS</w:t>
-      </w:r>
-      <w:r>
-        <w:t xml:space="preserve"> </w:t>
-      </w:r>
-      <w:r>
-        <w:t xml:space="preserve">(comma-separated)</w:t>
-      </w:r>
-      <w:r>
-        <w:t xml:space="preserve"> </w:t>
-      </w:r>
-      <w:r>
-        <w:t xml:space="preserve">- Payment:</w:t>
-      </w:r>
-      <w:r>
-        <w:t xml:space="preserve"> </w:t>
-      </w:r>
-      <w:r>
-        <w:rPr>
-          <w:rStyle w:val="VerbatimChar"/>
-        </w:rPr>
-        <w:t xml:space="preserve">SIKINA_*</w:t>
-      </w:r>
-      <w:r>
-        <w:t xml:space="preserve">,</w:t>
-      </w:r>
-      <w:r>
-        <w:t xml:space="preserve"> </w:t>
-      </w:r>
-      <w:r>
-        <w:rPr>
-          <w:rStyle w:val="VerbatimChar"/>
-        </w:rPr>
-        <w:t xml:space="preserve">AWASH_*</w:t>
-      </w:r>
-      <w:r>
-        <w:t xml:space="preserve"> </w:t>
-      </w:r>
-      <w:r>
-        <w:t xml:space="preserve">(optional)</w:t>
-      </w:r>
-    </w:p>
-    <w:bookmarkEnd w:id="13"/>
-    <w:bookmarkStart w:id="14" w:name="testing-verification"/>
-    <w:p>
-      <w:pPr>
-        <w:pStyle w:val="Heading2"/>
-      </w:pPr>
-      <w:r>
-        <w:rPr>
-          <w:rStyle w:val="SectionNumber"/>
-        </w:rPr>
-        <w:t xml:space="preserve">1.6</w:t>
-      </w:r>
-      <w:r>
-        <w:tab/>
-      </w:r>
-      <w:r>
-        <w:t xml:space="preserve">Testing &amp; verification</w:t>
-      </w:r>
-    </w:p>
-    <w:p>
-      <w:pPr>
-        <w:pStyle w:val="SourceCode"/>
-      </w:pPr>
-      <w:r>
-        <w:rPr>
-          <w:rStyle w:val="CommentTok"/>
-        </w:rPr>
-        <w:t xml:space="preserve"># Backend tests (per service)</w:t>
-      </w:r>
-      <w:r>
-        <w:br/>
-      </w:r>
-      <w:r>
-        <w:rPr>
-          <w:rStyle w:val="BuiltInTok"/>
-        </w:rPr>
-        <w:t xml:space="preserve">cd</w:t>
-      </w:r>
-      <w:r>
-        <w:rPr>
-          <w:rStyle w:val="NormalTok"/>
-        </w:rPr>
-        <w:t xml:space="preserve"> auction-engine </w:t>
-      </w:r>
-      <w:r>
-        <w:rPr>
-          <w:rStyle w:val="KeywordTok"/>
-        </w:rPr>
-        <w:t xml:space="preserve">&amp;&amp;</w:t>
-      </w:r>
-      <w:r>
-        <w:rPr>
-          <w:rStyle w:val="NormalTok"/>
-        </w:rPr>
-        <w:t xml:space="preserve"> </w:t>
-      </w:r>
-      <w:r>
-        <w:rPr>
-          <w:rStyle w:val="ExtensionTok"/>
-        </w:rPr>
-        <w:t xml:space="preserve">npm</w:t>
-      </w:r>
-      <w:r>
-        <w:rPr>
-          <w:rStyle w:val="NormalTok"/>
-        </w:rPr>
-        <w:t xml:space="preserve"> test        </w:t>
-      </w:r>
-      <w:r>
-        <w:rPr>
-          <w:rStyle w:val="CommentTok"/>
-        </w:rPr>
-        <w:t xml:space="preserve"># 27 tests</w:t>
-      </w:r>
-      <w:r>
-        <w:br/>
-      </w:r>
-      <w:r>
-        <w:rPr>
-          <w:rStyle w:val="BuiltInTok"/>
-        </w:rPr>
-        <w:t xml:space="preserve">cd</w:t>
-      </w:r>
-      <w:r>
-        <w:rPr>
-          <w:rStyle w:val="NormalTok"/>
-        </w:rPr>
-        <w:t xml:space="preserve"> identity-service </w:t>
-      </w:r>
-      <w:r>
-        <w:rPr>
-          <w:rStyle w:val="KeywordTok"/>
-        </w:rPr>
-        <w:t xml:space="preserve">&amp;&amp;</w:t>
-      </w:r>
-      <w:r>
-        <w:rPr>
-          <w:rStyle w:val="NormalTok"/>
-        </w:rPr>
-        <w:t xml:space="preserve"> </w:t>
-      </w:r>
-      <w:r>
-        <w:rPr>
-          <w:rStyle w:val="ExtensionTok"/>
-        </w:rPr>
-        <w:t xml:space="preserve">npm</w:t>
-      </w:r>
-      <w:r>
-        <w:rPr>
-          <w:rStyle w:val="NormalTok"/>
-        </w:rPr>
-        <w:t xml:space="preserve"> test      </w:t>
-      </w:r>
-      <w:r>
-        <w:rPr>
-          <w:rStyle w:val="CommentTok"/>
-        </w:rPr>
-        <w:t xml:space="preserve"># 2 tests</w:t>
-      </w:r>
-      <w:r>
-        <w:br/>
-      </w:r>
-      <w:r>
-        <w:rPr>
-          <w:rStyle w:val="BuiltInTok"/>
-        </w:rPr>
-        <w:t xml:space="preserve">cd</w:t>
-      </w:r>
-      <w:r>
-        <w:rPr>
-          <w:rStyle w:val="NormalTok"/>
-        </w:rPr>
-        <w:t xml:space="preserve"> query-service </w:t>
-      </w:r>
-      <w:r>
-        <w:rPr>
-          <w:rStyle w:val="KeywordTok"/>
-        </w:rPr>
-        <w:t xml:space="preserve">&amp;&amp;</w:t>
-      </w:r>
-      <w:r>
-        <w:rPr>
-          <w:rStyle w:val="NormalTok"/>
-        </w:rPr>
-        <w:t xml:space="preserve"> </w:t>
-      </w:r>
-      <w:r>
-        <w:rPr>
-          <w:rStyle w:val="ExtensionTok"/>
-        </w:rPr>
-        <w:t xml:space="preserve">npm</w:t>
-      </w:r>
-      <w:r>
-        <w:rPr>
-          <w:rStyle w:val="NormalTok"/>
-        </w:rPr>
-        <w:t xml:space="preserve"> test         </w:t>
-      </w:r>
-      <w:r>
-        <w:rPr>
-          <w:rStyle w:val="CommentTok"/>
-        </w:rPr>
-        <w:t xml:space="preserve"># 3 tests</w:t>
-      </w:r>
-      <w:r>
-        <w:br/>
-      </w:r>
-      <w:r>
-        <w:br/>
-      </w:r>
-      <w:r>
-        <w:rPr>
-          <w:rStyle w:val="CommentTok"/>
-        </w:rPr>
-        <w:t xml:space="preserve"># Type checking (per service/project)</w:t>
-      </w:r>
-      <w:r>
-        <w:br/>
-      </w:r>
-      <w:r>
-        <w:rPr>
-          <w:rStyle w:val="ExtensionTok"/>
-        </w:rPr>
-        <w:t xml:space="preserve">npx</w:t>
-      </w:r>
-      <w:r>
-        <w:rPr>
-          <w:rStyle w:val="NormalTok"/>
-        </w:rPr>
-        <w:t xml:space="preserve"> tsc </w:t>
-      </w:r>
-      <w:r>
-        <w:rPr>
-          <w:rStyle w:val="AttributeTok"/>
-        </w:rPr>
-        <w:t xml:space="preserve">--noEmit</w:t>
-      </w:r>
-    </w:p>
-    <w:bookmarkEnd w:id="14"/>
-    <w:bookmarkStart w:id="15" w:name="project-layout"/>
-    <w:p>
-      <w:pPr>
-        <w:pStyle w:val="Heading2"/>
-      </w:pPr>
-      <w:r>
-        <w:rPr>
-          <w:rStyle w:val="SectionNumber"/>
-        </w:rPr>
-        <w:t xml:space="preserve">1.7</w:t>
-      </w:r>
-      <w:r>
-        <w:tab/>
-      </w:r>
-      <w:r>
-        <w:t xml:space="preserve">Project layout</w:t>
-      </w:r>
-    </w:p>
-    <w:p>
-      <w:pPr>
-        <w:pStyle w:val="SourceCode"/>
-      </w:pPr>
-      <w:r>
-        <w:rPr>
-          <w:rStyle w:val="VerbatimChar"/>
-        </w:rPr>
-        <w:t xml:space="preserve">auction-engine/      NestJS bidding + winner + payments</w:t>
-      </w:r>
-      <w:r>
-        <w:br/>
-      </w:r>
-      <w:r>
-        <w:rPr>
-          <w:rStyle w:val="VerbatimChar"/>
-        </w:rPr>
-        <w:t xml:space="preserve">identity-service/    NestJS auth + wallet</w:t>
-      </w:r>
-      <w:r>
-        <w:br/>
-      </w:r>
-      <w:r>
-        <w:rPr>
-          <w:rStyle w:val="VerbatimChar"/>
-        </w:rPr>
-        <w:t xml:space="preserve">query-service/       NestJS read APIs</w:t>
-      </w:r>
-      <w:r>
-        <w:br/>
-      </w:r>
-      <w:r>
-        <w:rPr>
-          <w:rStyle w:val="VerbatimChar"/>
-        </w:rPr>
-        <w:t xml:space="preserve">takelow-web/         React + Vite + Tailwind</w:t>
-      </w:r>
-      <w:r>
-        <w:br/>
-      </w:r>
-      <w:r>
-        <w:rPr>
-          <w:rStyle w:val="VerbatimChar"/>
-        </w:rPr>
-        <w:t xml:space="preserve">takelow-app/         React Native (Expo)</w:t>
-      </w:r>
-      <w:r>
-        <w:br/>
-      </w:r>
-      <w:r>
-        <w:rPr>
-          <w:rStyle w:val="VerbatimChar"/>
-        </w:rPr>
-        <w:t xml:space="preserve">database/migrations/ 23 raw SQL migrations (idempotent, tracked)</w:t>
-      </w:r>
-      <w:r>
-        <w:br/>
-      </w:r>
-      <w:r>
-        <w:rPr>
-          <w:rStyle w:val="VerbatimChar"/>
-        </w:rPr>
-        <w:t xml:space="preserve">k8s/                 Kubernetes manifests (config, deployments, hpa, ingress)</w:t>
-      </w:r>
-      <w:r>
-        <w:br/>
-      </w:r>
-      <w:r>
-        <w:rPr>
-          <w:rStyle w:val="VerbatimChar"/>
-        </w:rPr>
-        <w:t xml:space="preserve">scripts/             dev/seed/migrate/wait helpers</w:t>
-      </w:r>
-      <w:r>
-        <w:br/>
-      </w:r>
-      <w:r>
-        <w:rPr>
-          <w:rStyle w:val="VerbatimChar"/>
-        </w:rPr>
-        <w:t xml:space="preserve">load-tests/          k6 bid-flood scenarios</w:t>
-      </w:r>
-    </w:p>
-    <w:p>
-      <w:pPr>
-        <w:pStyle w:val="FirstParagraph"/>
-      </w:pPr>
-      <w:r>
-        <w:t xml:space="preserve">See</w:t>
-      </w:r>
-      <w:r>
-        <w:t xml:space="preserve"> </w:t>
-      </w:r>
-      <w:r>
-        <w:rPr>
-          <w:rStyle w:val="VerbatimChar"/>
-        </w:rPr>
-        <w:t xml:space="preserve">SRS.md</w:t>
-      </w:r>
-      <w:r>
-        <w:t xml:space="preserve"> </w:t>
-      </w:r>
-      <w:r>
-        <w:t xml:space="preserve">for the full requirements specification,</w:t>
-      </w:r>
-      <w:r>
-        <w:t xml:space="preserve"> </w:t>
-      </w:r>
-      <w:r>
-        <w:rPr>
-          <w:rStyle w:val="VerbatimChar"/>
-        </w:rPr>
-        <w:t xml:space="preserve">SECURITY.md</w:t>
-      </w:r>
-      <w:r>
-        <w:t xml:space="preserve"> </w:t>
-      </w:r>
-      <w:r>
-        <w:t xml:space="preserve">for the security model, and</w:t>
-      </w:r>
-      <w:r>
-        <w:t xml:space="preserve"> </w:t>
-      </w:r>
-      <w:r>
-        <w:rPr>
-          <w:rStyle w:val="VerbatimChar"/>
-        </w:rPr>
         <w:t xml:space="preserve">br.md</w:t>
       </w:r>
       <w:r>
@@ -1435,8 +4701,8 @@
         <w:t xml:space="preserve">for the business requirements status.</w:t>
       </w:r>
     </w:p>
-    <w:bookmarkEnd w:id="15"/>
-    <w:bookmarkEnd w:id="16"/>
+    <w:bookmarkEnd w:id="30"/>
+    <w:bookmarkEnd w:id="31"/>
     <w:sectPr>
       <w:footnotePr>
         <w:numRestart w:val="eachSect"/>
@@ -1654,6 +4920,24 @@
     <w:abstractNumId w:val="990"/>
   </w:num>
   <w:num w:numId="1001">
+    <w:abstractNumId w:val="991"/>
+  </w:num>
+  <w:num w:numId="1002">
+    <w:abstractNumId w:val="991"/>
+  </w:num>
+  <w:num w:numId="1003">
+    <w:abstractNumId w:val="991"/>
+  </w:num>
+  <w:num w:numId="1004">
+    <w:abstractNumId w:val="991"/>
+  </w:num>
+  <w:num w:numId="1005">
+    <w:abstractNumId w:val="991"/>
+  </w:num>
+  <w:num w:numId="1006">
+    <w:abstractNumId w:val="991"/>
+  </w:num>
+  <w:num w:numId="1007">
     <w:abstractNumId w:val="991"/>
   </w:num>
 </w:numbering>

</xml_diff>